<commit_message>
Updated problem statement; further mosquito notes added to intro
</commit_message>
<xml_diff>
--- a/images/HW3/G2_Proposal.docx
+++ b/images/HW3/G2_Proposal.docx
@@ -33,7 +33,12 @@
     <w:p>
       <w:r>
         <w:tab/>
-        <w:t xml:space="preserve">Our intent is to compare </w:t>
+      </w:r>
+      <w:r>
+        <w:t>Experiment: o</w:t>
+      </w:r>
+      <w:r>
+        <w:t xml:space="preserve">ur intent is to compare </w:t>
       </w:r>
       <w:r>
         <w:t xml:space="preserve">up to </w:t>
@@ -68,11 +73,51 @@
       <w:r>
         <w:t xml:space="preserve"> edge processing driven by computer vision.</w:t>
       </w:r>
-      <w:r>
-        <w:t xml:space="preserve">  Depending on our findings, we may only choose one approach to study or do a survey of methods to determine which of the two is more viable for</w:t>
-      </w:r>
-      <w:r>
-        <w:t xml:space="preserve"> dispensing</w:t>
+    </w:p>
+    <w:p>
+      <w:pPr>
+        <w:ind w:firstLine="720"/>
+      </w:pPr>
+      <w:r>
+        <w:t xml:space="preserve">Survey: our intent is to identify spatial data analysis tools and techniques that can be used to optimize mosquito control deployments.  This can range from applications for autonomous drones to tools to identify the optimal areas and </w:t>
+      </w:r>
+      <w:r>
+        <w:t>time windows</w:t>
+      </w:r>
+      <w:r>
+        <w:t xml:space="preserve"> to deploy controls.</w:t>
+      </w:r>
+    </w:p>
+    <w:p>
+      <w:pPr>
+        <w:ind w:firstLine="720"/>
+      </w:pPr>
+      <w:r>
+        <w:t>Depending on our findings</w:t>
+      </w:r>
+      <w:r>
+        <w:t xml:space="preserve"> </w:t>
+      </w:r>
+      <w:r>
+        <w:t>for the experiment proposal</w:t>
+      </w:r>
+      <w:r>
+        <w:t xml:space="preserve">, we may only choose one approach to </w:t>
+      </w:r>
+      <w:r>
+        <w:t>experiment, two methods to contrast them,</w:t>
+      </w:r>
+      <w:r>
+        <w:t xml:space="preserve"> or do </w:t>
+      </w:r>
+      <w:r>
+        <w:t>the</w:t>
+      </w:r>
+      <w:r>
+        <w:t xml:space="preserve"> survey</w:t>
+      </w:r>
+      <w:r>
+        <w:t xml:space="preserve"> instead</w:t>
       </w:r>
       <w:r>
         <w:t>.</w:t>
@@ -336,7 +381,11 @@
         <w:ind w:firstLine="720"/>
       </w:pPr>
       <w:r>
-        <w:t>One significant expected trend to note of is that terrestrial ecosystems across the globe are highly likely to experience attribution from climate change.  In addition, the North American, European, Small Island and Arctic regions are all highly likely to experience attributions from climate change.  It is also clear that nearly all cities, infrastructure, health and (human) wellbeing are expected to experience adverse impacts without notable positives.</w:t>
+        <w:t xml:space="preserve">One significant expected trend to note of is that terrestrial ecosystems across the globe are highly likely to experience attribution from climate change.  In addition, the North American, European, Small Island and Arctic regions are all highly likely to experience </w:t>
+      </w:r>
+      <w:r>
+        <w:lastRenderedPageBreak/>
+        <w:t>attributions from climate change.  It is also clear that nearly all cities, infrastructure, health and (human) wellbeing are expected to experience adverse impacts without notable positives.</w:t>
       </w:r>
       <w:r>
         <w:t xml:space="preserve">  Based on the</w:t>
@@ -350,7 +399,6 @@
         <w:ind w:firstLine="720"/>
       </w:pPr>
       <w:r>
-        <w:lastRenderedPageBreak/>
         <w:drawing>
           <wp:inline distT="0" distB="0" distL="0" distR="0" wp14:anchorId="4728435D" wp14:editId="53FAEC7E">
             <wp:extent cx="4885899" cy="5948687"/>
@@ -471,7 +519,11 @@
         <w:t xml:space="preserve">particularly </w:t>
       </w:r>
       <w:r>
-        <w:t>going to become increasingly strained for availabilit</w:t>
+        <w:t xml:space="preserve">going to </w:t>
+      </w:r>
+      <w:r>
+        <w:lastRenderedPageBreak/>
+        <w:t>become increasingly strained for availabilit</w:t>
       </w:r>
       <w:r>
         <w:t>y</w:t>
@@ -524,25 +576,61 @@
         <w:ind w:firstLine="720"/>
       </w:pPr>
       <w:r>
-        <w:t xml:space="preserve">A particular example of environmental control </w:t>
+        <w:t xml:space="preserve">A particular example of </w:t>
+      </w:r>
+      <w:r>
+        <w:t>environmental</w:t>
+      </w:r>
+      <w:r>
+        <w:t xml:space="preserve"> control </w:t>
       </w:r>
       <w:r>
         <w:t xml:space="preserve">that interests us </w:t>
       </w:r>
       <w:r>
-        <w:t>is managing mosquito populations.  Mosquitos can carry deadly diseases such as Dengue, Malaria, West Nile and Zika viruses [4].</w:t>
+        <w:t xml:space="preserve">and will likely be affected by climate change </w:t>
+      </w:r>
+      <w:r>
+        <w:t>is managing mosquito populations.</w:t>
       </w:r>
       <w:r>
         <w:t xml:space="preserve">  </w:t>
       </w:r>
       <w:r>
+        <w:t>Mosquitos can carry deadly diseases such as Dengue, Malaria, West Nile and Zika viruses [4].</w:t>
+      </w:r>
+      <w:r>
+        <w:t xml:space="preserve">  </w:t>
+      </w:r>
+      <w:r>
         <w:t>Controlling mosquito populations is thus a critical line of defense for preventing deadly diseases from spreading to people</w:t>
       </w:r>
       <w:r>
         <w:t xml:space="preserve">.  </w:t>
       </w:r>
       <w:r>
-        <w:t>To control mosquito populations, [insert method used now here].</w:t>
+        <w:t>To control mosquito populations</w:t>
+      </w:r>
+      <w:r>
+        <w:t xml:space="preserve">, the Minneapolis Mosquito Control District </w:t>
+      </w:r>
+      <w:r>
+        <w:t xml:space="preserve">(MMDC) </w:t>
+      </w:r>
+      <w:r>
+        <w:t>employs various larval controls such as Bacillus thuringiensis isrealensis (Bti), methoprene and Spinosad [9]</w:t>
+      </w:r>
+      <w:r>
+        <w:t>.</w:t>
+      </w:r>
+      <w:r>
+        <w:t xml:space="preserve">  Deploying these controls requires identifying mosquito nesting locations while the mosquitos are still in their larval state</w:t>
+      </w:r>
+      <w:r>
+        <w:t>.</w:t>
+      </w:r>
+      <w:r>
+        <w:t xml:space="preserve"> </w:t>
       </w:r>
     </w:p>
     <w:p>
@@ -553,13 +641,37 @@
         <w:t>The</w:t>
       </w:r>
       <w:r>
-        <w:t xml:space="preserve">re are two main challenges to overcome when reducing mosquito populations with </w:t>
-      </w:r>
-      <w:r>
-        <w:t>the current</w:t>
-      </w:r>
-      <w:r>
-        <w:t xml:space="preserve"> method: exposure risk and environmental risk.  Exposure to the mosquito population greatly increases the chances of mosquito bites and </w:t>
+        <w:t xml:space="preserve">re are </w:t>
+      </w:r>
+      <w:r>
+        <w:t>three</w:t>
+      </w:r>
+      <w:r>
+        <w:t xml:space="preserve"> main challenges to overcome when reducing mosquito populations with </w:t>
+      </w:r>
+      <w:r>
+        <w:t xml:space="preserve">the </w:t>
+      </w:r>
+      <w:r>
+        <w:t xml:space="preserve">MMCD’s </w:t>
+      </w:r>
+      <w:r>
+        <w:t>current</w:t>
+      </w:r>
+      <w:r>
+        <w:t xml:space="preserve"> method</w:t>
+      </w:r>
+      <w:r>
+        <w:t>.</w:t>
+      </w:r>
+      <w:r>
+        <w:t xml:space="preserve"> </w:t>
+      </w:r>
+      <w:r>
+        <w:t xml:space="preserve"> </w:t>
+      </w:r>
+      <w:r>
+        <w:t xml:space="preserve">Exposure to the mosquito population greatly increases the chances of mosquito bites and </w:t>
       </w:r>
       <w:r>
         <w:t>in turn</w:t>
@@ -580,13 +692,10 @@
         <w:t xml:space="preserve"> diseases.  </w:t>
       </w:r>
       <w:r>
-        <w:t xml:space="preserve">At the same time, attempting to control mosquito populations can disturb the freshwater food webs they tend to be a part of if deployment isn’t methodical.  For example, the </w:t>
-      </w:r>
-      <w:r>
-        <w:t xml:space="preserve">commonly used </w:t>
-      </w:r>
-      <w:r>
-        <w:t>biocide Bacillus thuringiensis israelensis (Bti) presents risks to chironomid larvae as well</w:t>
+        <w:t xml:space="preserve">At the same time, attempting to control mosquito populations can disturb the freshwater food webs they tend to be a part of if deployment isn’t methodical.  For example, </w:t>
+      </w:r>
+      <w:r>
+        <w:t>Bti presents risks to chironomid larvae as well</w:t>
       </w:r>
       <w:r>
         <w:t xml:space="preserve"> as to mosquito larvae [5].  Chironomids </w:t>
@@ -600,11 +709,39 @@
       <w:r>
         <w:t>.  Deploying too much Bti risks significantly reducing the chironomid species and thus doing more harm to the environment.</w:t>
       </w:r>
-    </w:p>
-    <w:p>
-      <w:pPr>
-        <w:ind w:firstLine="720"/>
-      </w:pPr>
+      <w:r>
+        <w:t xml:space="preserve">  </w:t>
+      </w:r>
+      <w:r>
+        <w:t xml:space="preserve">The third challenge is the </w:t>
+      </w:r>
+      <w:r>
+        <w:t xml:space="preserve">required accuracy of </w:t>
+      </w:r>
+      <w:r>
+        <w:t xml:space="preserve">deployment procedure itself, and that is where we believe our method will be </w:t>
+      </w:r>
+      <w:r>
+        <w:t>able to fill a gap caused by resource constraints.</w:t>
+      </w:r>
+      <w:r>
+        <w:t xml:space="preserve">  Deployment can only be done on a seasonal basis </w:t>
+      </w:r>
+      <w:r>
+        <w:t>to</w:t>
+      </w:r>
+      <w:r>
+        <w:t xml:space="preserve"> target the larvae before they develop into adult</w:t>
+      </w:r>
+      <w:r>
+        <w:t>s</w:t>
+      </w:r>
+      <w:r>
+        <w:t>.</w:t>
+      </w:r>
+      <w:r>
+        <w:t xml:space="preserve">  A successful deployment framework for mosquito controls will thus be deployed over a familiar seasonal landscape, with accurate identification of the targeted areas and a measured volume of the control deployed.</w:t>
+      </w:r>
     </w:p>
     <w:p>
       <w:pPr>
@@ -678,6 +815,7 @@
         <w:ind w:firstLine="720"/>
       </w:pPr>
       <w:r>
+        <w:lastRenderedPageBreak/>
         <w:t>Meanwhile the existing edge processing and real-world models tend to not be focused on a task as specific as identifying mosquito populations or nesting areas…</w:t>
       </w:r>
     </w:p>
@@ -765,7 +903,6 @@
         <w:ind w:firstLine="720"/>
       </w:pPr>
       <w:r>
-        <w:lastRenderedPageBreak/>
         <w:t xml:space="preserve">Evaluating </w:t>
       </w:r>
       <w:r>
@@ -1101,6 +1238,7 @@
               <w:jc w:val="center"/>
             </w:pPr>
             <w:r>
+              <w:lastRenderedPageBreak/>
               <w:t>3/25</w:t>
             </w:r>
           </w:p>
@@ -1363,7 +1501,6 @@
           <w:b/>
           <w:bCs/>
         </w:rPr>
-        <w:lastRenderedPageBreak/>
         <w:t>Resources</w:t>
       </w:r>
     </w:p>
@@ -1652,7 +1789,10 @@
         </w:numPr>
       </w:pPr>
       <w:r>
-        <w:t>Bevacqua, E., Schleussner, CF. &amp; Zscheischler, J. A year above 1.5</w:t>
+        <w:t>Bevacqua, E., Schleussner, CF. &amp; Zscheischler, J</w:t>
+      </w:r>
+      <w:r>
+        <w:t>. A year above 1.5</w:t>
       </w:r>
       <w:r>
         <w:rPr>
@@ -1667,7 +1807,10 @@
         <w:t>°</w:t>
       </w:r>
       <w:r>
-        <w:t>C signals that Earth is most probably within the 20-year period that will reach the Paris Agreement limit.</w:t>
+        <w:t>C signals that Earth is most probably within the 20-year period that will reach the Paris Agreement limit</w:t>
+      </w:r>
+      <w:r>
+        <w:t>.</w:t>
       </w:r>
       <w:r>
         <w:rPr>
@@ -1762,6 +1905,37 @@
             <w:rStyle w:val="Hyperlink"/>
           </w:rPr>
           <w:t>https://doi.org/10.1038/s41558-025-02247-8</w:t>
+        </w:r>
+      </w:hyperlink>
+    </w:p>
+    <w:p>
+      <w:pPr>
+        <w:pStyle w:val="ListParagraph"/>
+        <w:numPr>
+          <w:ilvl w:val="0"/>
+          <w:numId w:val="2"/>
+        </w:numPr>
+      </w:pPr>
+      <w:r>
+        <w:lastRenderedPageBreak/>
+        <w:t xml:space="preserve">MMCD, 2026, </w:t>
+      </w:r>
+      <w:r>
+        <w:rPr>
+          <w:i/>
+          <w:iCs/>
+        </w:rPr>
+        <w:t>Mosquito Control</w:t>
+      </w:r>
+      <w:r>
+        <w:t xml:space="preserve">, </w:t>
+      </w:r>
+      <w:hyperlink r:id="rId14" w:history="1">
+        <w:r>
+          <w:rPr>
+            <w:rStyle w:val="Hyperlink"/>
+          </w:rPr>
+          <w:t>https://mmcd.org/mosquito-control/</w:t>
         </w:r>
       </w:hyperlink>
     </w:p>

</xml_diff>

<commit_message>
Revised proposal after discussion
</commit_message>
<xml_diff>
--- a/images/HW3/G2_Proposal.docx
+++ b/images/HW3/G2_Proposal.docx
@@ -35,57 +35,198 @@
         <w:tab/>
       </w:r>
       <w:r>
-        <w:t>Experiment: o</w:t>
+        <w:t>O</w:t>
       </w:r>
       <w:r>
         <w:t xml:space="preserve">ur intent is to compare </w:t>
       </w:r>
       <w:r>
-        <w:t xml:space="preserve">up to </w:t>
-      </w:r>
-      <w:r>
-        <w:t xml:space="preserve">two methods of utilizing autonomous drones to dispense mosquito repellent in a marshland setting.  Contrasting with the current adopted method of using manually controlled drones, our goal is to determine if it is more efficient to instead disperse the repellent using either: a truck </w:t>
-      </w:r>
-      <w:r>
-        <w:t>that can</w:t>
-      </w:r>
-      <w:r>
-        <w:t xml:space="preserve"> operate the drone</w:t>
-      </w:r>
-      <w:r>
-        <w:t>(</w:t>
+        <w:t xml:space="preserve">two EGI training methods for the purpose of </w:t>
+      </w:r>
+      <w:r>
+        <w:t>seeking mosquito nests</w:t>
+      </w:r>
+      <w:r>
+        <w:t>.</w:t>
+      </w:r>
+      <w:r>
+        <w:t xml:space="preserve">  The first method will utilize autonomous drones via edge protocols</w:t>
+      </w:r>
+      <w:r>
+        <w:t>.</w:t>
+      </w:r>
+      <w:r>
+        <w:t xml:space="preserve"> </w:t>
+      </w:r>
+      <w:r>
+        <w:t xml:space="preserve"> T</w:t>
+      </w:r>
+      <w:r>
+        <w:t>he second will utilize near-edge protocol</w:t>
       </w:r>
       <w:r>
         <w:t>s</w:t>
       </w:r>
       <w:r>
-        <w:t>)</w:t>
-      </w:r>
-      <w:r>
-        <w:t xml:space="preserve"> autonomously</w:t>
-      </w:r>
-      <w:r>
-        <w:t xml:space="preserve"> with a real-world model</w:t>
-      </w:r>
-      <w:r>
-        <w:t>; or a collection of drones with</w:t>
-      </w:r>
-      <w:r>
-        <w:t xml:space="preserve"> edge processing driven by computer vision.</w:t>
+        <w:t xml:space="preserve"> in the form of a </w:t>
+      </w:r>
+      <w:r>
+        <w:t xml:space="preserve">truck that controls </w:t>
+      </w:r>
+      <w:r>
+        <w:t xml:space="preserve">the </w:t>
+      </w:r>
+      <w:r>
+        <w:t>drones autonomously.</w:t>
       </w:r>
     </w:p>
     <w:p>
-      <w:pPr>
-        <w:ind w:firstLine="720"/>
-      </w:pPr>
-      <w:r>
-        <w:t xml:space="preserve">Survey: our intent is to identify spatial data analysis tools and techniques that can be used to optimize mosquito control deployments.  This can range from applications for autonomous drones to tools to identify the optimal areas and </w:t>
-      </w:r>
-      <w:r>
-        <w:t>time windows</w:t>
-      </w:r>
-      <w:r>
-        <w:t xml:space="preserve"> to deploy controls.</w:t>
+      <w:r>
+        <w:rPr>
+          <w:b/>
+          <w:bCs/>
+        </w:rPr>
+        <w:t>Introduction</w:t>
+      </w:r>
+      <w:r>
+        <w:rPr>
+          <w:b/>
+          <w:bCs/>
+        </w:rPr>
+        <w:br/>
+      </w:r>
+      <w:r>
+        <w:rPr>
+          <w:b/>
+          <w:bCs/>
+        </w:rPr>
+        <w:tab/>
+      </w:r>
+      <w:r>
+        <w:t>Auto</w:t>
+      </w:r>
+      <w:r>
+        <w:t xml:space="preserve">mated analysis and prediction model generation </w:t>
+      </w:r>
+      <w:r>
+        <w:t>has</w:t>
+      </w:r>
+      <w:r>
+        <w:t xml:space="preserve"> advanced quite considerably</w:t>
+      </w:r>
+      <w:r>
+        <w:t xml:space="preserve"> to present day</w:t>
+      </w:r>
+      <w:r>
+        <w:t>.</w:t>
+      </w:r>
+      <w:r>
+        <w:t xml:space="preserve"> </w:t>
+      </w:r>
+      <w:r>
+        <w:t xml:space="preserve"> N</w:t>
+      </w:r>
+      <w:r>
+        <w:t>otable examples rang</w:t>
+      </w:r>
+      <w:r>
+        <w:t>e</w:t>
+      </w:r>
+      <w:r>
+        <w:t xml:space="preserve"> from </w:t>
+      </w:r>
+      <w:r>
+        <w:t xml:space="preserve">Waymo’s autonomous </w:t>
+      </w:r>
+      <w:r>
+        <w:t>ridesharing vehicles</w:t>
+      </w:r>
+      <w:r>
+        <w:t xml:space="preserve"> [1]</w:t>
+      </w:r>
+      <w:r>
+        <w:t xml:space="preserve">, </w:t>
+      </w:r>
+      <w:r>
+        <w:t>John Deer</w:t>
+      </w:r>
+      <w:r>
+        <w:t>e</w:t>
+      </w:r>
+      <w:r>
+        <w:t xml:space="preserve">’s </w:t>
+      </w:r>
+      <w:r>
+        <w:t>Precision AG Technology [2]</w:t>
+      </w:r>
+      <w:r>
+        <w:t>,</w:t>
+      </w:r>
+      <w:r>
+        <w:t xml:space="preserve"> and</w:t>
+      </w:r>
+      <w:r>
+        <w:t xml:space="preserve"> the rec</w:t>
+      </w:r>
+      <w:r>
+        <w:t>ent application of attack drones in</w:t>
+      </w:r>
+      <w:r>
+        <w:t xml:space="preserve"> Operation Spider’s Web</w:t>
+      </w:r>
+      <w:r>
+        <w:t xml:space="preserve"> </w:t>
+      </w:r>
+      <w:r>
+        <w:t>[3]</w:t>
+      </w:r>
+      <w:r>
+        <w:t xml:space="preserve">.  </w:t>
+      </w:r>
+      <w:r>
+        <w:t>All three enterprises</w:t>
+      </w:r>
+      <w:r>
+        <w:t xml:space="preserve"> </w:t>
+      </w:r>
+      <w:r>
+        <w:t>are</w:t>
+      </w:r>
+      <w:r>
+        <w:t xml:space="preserve"> </w:t>
+      </w:r>
+      <w:r>
+        <w:t xml:space="preserve">also </w:t>
+      </w:r>
+      <w:r>
+        <w:t xml:space="preserve">examples </w:t>
+      </w:r>
+      <w:r>
+        <w:t>of</w:t>
+      </w:r>
+      <w:r>
+        <w:t xml:space="preserve"> </w:t>
+      </w:r>
+      <w:r>
+        <w:t xml:space="preserve">spatial data being used to remove people from harm’s way, </w:t>
+      </w:r>
+      <w:r>
+        <w:t xml:space="preserve">reduce costs </w:t>
+      </w:r>
+      <w:r>
+        <w:t>or</w:t>
+      </w:r>
+      <w:r>
+        <w:t xml:space="preserve"> improve </w:t>
+      </w:r>
+      <w:r>
+        <w:t>production</w:t>
+      </w:r>
+      <w:r>
+        <w:t>.</w:t>
+      </w:r>
+      <w:r>
+        <w:t xml:space="preserve">  Presuming that the hardware for data training remains readily accessible, applying spatial data will continue to provide economic and societal benefits.</w:t>
       </w:r>
     </w:p>
     <w:p>
@@ -93,183 +234,111 @@
         <w:ind w:firstLine="720"/>
       </w:pPr>
       <w:r>
-        <w:t>Depending on our findings</w:t>
+        <w:t xml:space="preserve">One area where this technology is </w:t>
+      </w:r>
+      <w:r>
+        <w:t xml:space="preserve">likely </w:t>
+      </w:r>
+      <w:r>
+        <w:t xml:space="preserve">going to become critical is </w:t>
+      </w:r>
+      <w:r>
+        <w:t xml:space="preserve">environmental </w:t>
+      </w:r>
+      <w:r>
+        <w:t>preservation</w:t>
+      </w:r>
+      <w:r>
+        <w:t xml:space="preserve"> and </w:t>
+      </w:r>
+      <w:r>
+        <w:t>adaptation</w:t>
+      </w:r>
+      <w:r>
+        <w:t>.</w:t>
+      </w:r>
+      <w:r>
+        <w:t xml:space="preserve">  </w:t>
+      </w:r>
+      <w:r>
+        <w:t xml:space="preserve">The most recent </w:t>
+      </w:r>
+      <w:r>
+        <w:t xml:space="preserve">(2022) </w:t>
+      </w:r>
+      <w:r>
+        <w:t xml:space="preserve">report of the IPCC indicates that </w:t>
+      </w:r>
+      <w:r>
+        <w:t xml:space="preserve">various </w:t>
+      </w:r>
+      <w:r>
+        <w:t xml:space="preserve">natural and </w:t>
+      </w:r>
+      <w:r>
+        <w:t>develop</w:t>
+      </w:r>
+      <w:r>
+        <w:t>ed ecosystems</w:t>
+      </w:r>
+      <w:r>
+        <w:t xml:space="preserve"> are all subject to </w:t>
+      </w:r>
+      <w:r>
+        <w:t xml:space="preserve">adverse impacts from the changes in the climate caused by greenhouse gas emissions from human enterprises </w:t>
+      </w:r>
+      <w:r>
+        <w:t xml:space="preserve">should the global average temperature </w:t>
+      </w:r>
+      <w:r>
+        <w:t xml:space="preserve">reach </w:t>
+      </w:r>
+      <w:r>
+        <w:t>1.5</w:t>
+      </w:r>
+      <w:r>
+        <w:t>⁰C</w:t>
       </w:r>
       <w:r>
         <w:t xml:space="preserve"> </w:t>
       </w:r>
       <w:r>
-        <w:t>for the experiment proposal</w:t>
-      </w:r>
-      <w:r>
-        <w:t xml:space="preserve">, we may only choose one approach to </w:t>
-      </w:r>
-      <w:r>
-        <w:t>experiment, two methods to contrast them,</w:t>
-      </w:r>
-      <w:r>
-        <w:t xml:space="preserve"> or do </w:t>
-      </w:r>
-      <w:r>
-        <w:t>the</w:t>
-      </w:r>
-      <w:r>
-        <w:t xml:space="preserve"> survey</w:t>
-      </w:r>
-      <w:r>
-        <w:t xml:space="preserve"> instead</w:t>
+        <w:t xml:space="preserve">above the global average in the pre-industrial era </w:t>
+      </w:r>
+      <w:r>
+        <w:t>[6].</w:t>
+      </w:r>
+      <w:r>
+        <w:t xml:space="preserve">  </w:t>
+      </w:r>
+      <w:r>
+        <w:t>You can observe Figure SPM.2</w:t>
+      </w:r>
+      <w:r>
+        <w:t>, which was taken directly from the IPCC’s Sixth Assessment Report,</w:t>
+      </w:r>
+      <w:r>
+        <w:t xml:space="preserve"> on the next page </w:t>
+      </w:r>
+      <w:r>
+        <w:t>to see how various systems are expected to be affected by climate change</w:t>
       </w:r>
       <w:r>
         <w:t>.</w:t>
       </w:r>
     </w:p>
     <w:p>
-      <w:r>
-        <w:rPr>
-          <w:b/>
-          <w:bCs/>
-        </w:rPr>
-        <w:t>Introduction</w:t>
-      </w:r>
-      <w:r>
-        <w:rPr>
-          <w:b/>
-          <w:bCs/>
-        </w:rPr>
-        <w:br/>
-      </w:r>
-      <w:r>
-        <w:rPr>
-          <w:b/>
-          <w:bCs/>
-        </w:rPr>
-        <w:tab/>
-      </w:r>
-      <w:r>
-        <w:t>Auto</w:t>
-      </w:r>
-      <w:r>
-        <w:t xml:space="preserve">mated analysis and prediction model generation </w:t>
-      </w:r>
-      <w:r>
-        <w:t>has</w:t>
-      </w:r>
-      <w:r>
-        <w:t xml:space="preserve"> advanced quite considerably</w:t>
-      </w:r>
-      <w:r>
-        <w:t xml:space="preserve"> to present day</w:t>
-      </w:r>
-      <w:r>
-        <w:t>.</w:t>
-      </w:r>
-      <w:r>
-        <w:t xml:space="preserve"> </w:t>
-      </w:r>
-      <w:r>
-        <w:t xml:space="preserve"> N</w:t>
-      </w:r>
-      <w:r>
-        <w:t>otable examples rang</w:t>
-      </w:r>
-      <w:r>
-        <w:t>e</w:t>
-      </w:r>
-      <w:r>
-        <w:t xml:space="preserve"> from </w:t>
-      </w:r>
-      <w:r>
-        <w:t xml:space="preserve">Waymo’s autonomous </w:t>
-      </w:r>
-      <w:r>
-        <w:t>ridesharing vehicles</w:t>
-      </w:r>
-      <w:r>
-        <w:t xml:space="preserve"> [1]</w:t>
-      </w:r>
-      <w:r>
-        <w:t xml:space="preserve">, </w:t>
-      </w:r>
-      <w:r>
-        <w:t>John Deer</w:t>
-      </w:r>
-      <w:r>
-        <w:t>e</w:t>
-      </w:r>
-      <w:r>
-        <w:t xml:space="preserve">’s </w:t>
-      </w:r>
-      <w:r>
-        <w:t>Precision AG Technology [2]</w:t>
-      </w:r>
-      <w:r>
-        <w:t>,</w:t>
-      </w:r>
-      <w:r>
-        <w:t xml:space="preserve"> and</w:t>
-      </w:r>
-      <w:r>
-        <w:t xml:space="preserve"> the rec</w:t>
-      </w:r>
-      <w:r>
-        <w:t>ent application of attack drones in</w:t>
-      </w:r>
-      <w:r>
-        <w:t xml:space="preserve"> Operation Spider’s Web</w:t>
-      </w:r>
-      <w:r>
-        <w:t xml:space="preserve"> </w:t>
-      </w:r>
-      <w:r>
-        <w:t>[3]</w:t>
-      </w:r>
-      <w:r>
-        <w:t xml:space="preserve">.  </w:t>
-      </w:r>
-      <w:r>
-        <w:t>All three enterprises</w:t>
-      </w:r>
-      <w:r>
-        <w:t xml:space="preserve"> </w:t>
-      </w:r>
-      <w:r>
-        <w:t>are</w:t>
-      </w:r>
-      <w:r>
-        <w:t xml:space="preserve"> </w:t>
-      </w:r>
-      <w:r>
-        <w:t xml:space="preserve">also </w:t>
-      </w:r>
-      <w:r>
-        <w:t xml:space="preserve">examples </w:t>
-      </w:r>
-      <w:r>
-        <w:t>of</w:t>
-      </w:r>
-      <w:r>
-        <w:t xml:space="preserve"> </w:t>
-      </w:r>
-      <w:r>
-        <w:t xml:space="preserve">spatial data being used to remove people from harm’s way, </w:t>
-      </w:r>
-      <w:r>
-        <w:t xml:space="preserve">reduce costs </w:t>
-      </w:r>
-      <w:r>
-        <w:t>or</w:t>
-      </w:r>
-      <w:r>
-        <w:t xml:space="preserve"> improve </w:t>
-      </w:r>
-      <w:r>
-        <w:t>production</w:t>
-      </w:r>
-      <w:r>
-        <w:t>.</w:t>
-      </w:r>
-      <w:r>
-        <w:t xml:space="preserve">  Presuming that the hardware for data training remains readily accessible, applying spatial data will continue to provide economic and societal benefits.</w:t>
+      <w:pPr>
+        <w:ind w:firstLine="720"/>
+      </w:pPr>
+      <w:r>
+        <w:t>One significant expected trend to note of is that terrestrial ecosystems across the globe are highly likely to experience attribution from climate change.  In addition, the North American, European, Small Island and Arctic regions are all highly likely to experience attributions from climate change.  It is also clear that nearly all cities, infrastructure, health and (human) wellbeing are expected to experience adverse impacts without notable positives.</w:t>
+      </w:r>
+      <w:r>
+        <w:t xml:space="preserve">  Based on the</w:t>
+      </w:r>
+      <w:r>
+        <w:t>se trends, should they come to pass, we can expect that managing these risks will involve deciding whether to prioritize human systems or ecosystems.</w:t>
       </w:r>
     </w:p>
     <w:p>
@@ -277,128 +346,10 @@
         <w:ind w:firstLine="720"/>
       </w:pPr>
       <w:r>
-        <w:t xml:space="preserve">One area where this technology is </w:t>
-      </w:r>
-      <w:r>
-        <w:t xml:space="preserve">likely </w:t>
-      </w:r>
-      <w:r>
-        <w:t xml:space="preserve">going to become critical is </w:t>
-      </w:r>
-      <w:r>
-        <w:t xml:space="preserve">environmental </w:t>
-      </w:r>
-      <w:r>
-        <w:t>preservation</w:t>
-      </w:r>
-      <w:r>
-        <w:t xml:space="preserve"> and </w:t>
-      </w:r>
-      <w:r>
-        <w:t>adaptation</w:t>
-      </w:r>
-      <w:r>
-        <w:t>.</w:t>
-      </w:r>
-      <w:r>
-        <w:t xml:space="preserve">  </w:t>
-      </w:r>
-      <w:r>
-        <w:t xml:space="preserve">The most recent </w:t>
-      </w:r>
-      <w:r>
-        <w:t xml:space="preserve">(2022) </w:t>
-      </w:r>
-      <w:r>
-        <w:t xml:space="preserve">report of the IPCC indicates that </w:t>
-      </w:r>
-      <w:r>
-        <w:t xml:space="preserve">various </w:t>
-      </w:r>
-      <w:r>
-        <w:t xml:space="preserve">natural and </w:t>
-      </w:r>
-      <w:r>
-        <w:t>develop</w:t>
-      </w:r>
-      <w:r>
-        <w:t>ed ecosystems</w:t>
-      </w:r>
-      <w:r>
-        <w:t xml:space="preserve"> are all subject to </w:t>
-      </w:r>
-      <w:r>
-        <w:t xml:space="preserve">adverse impacts from the changes in the climate caused by greenhouse gas emissions from human enterprises </w:t>
-      </w:r>
-      <w:r>
-        <w:t xml:space="preserve">should the global average temperature </w:t>
-      </w:r>
-      <w:r>
-        <w:t xml:space="preserve">reach </w:t>
-      </w:r>
-      <w:r>
-        <w:t>1.5</w:t>
-      </w:r>
-      <w:r>
-        <w:t>⁰C</w:t>
-      </w:r>
-      <w:r>
-        <w:t xml:space="preserve"> </w:t>
-      </w:r>
-      <w:r>
-        <w:t xml:space="preserve">above the global average in the pre-industrial era </w:t>
-      </w:r>
-      <w:r>
-        <w:t>[6].</w:t>
-      </w:r>
-      <w:r>
-        <w:t xml:space="preserve">  </w:t>
-      </w:r>
-      <w:r>
-        <w:t>You can observe Figure SPM.2</w:t>
-      </w:r>
-      <w:r>
-        <w:t xml:space="preserve">, </w:t>
-      </w:r>
-      <w:r>
-        <w:t>which was taken directly from the IPCC’s Sixth Assessment Report</w:t>
-      </w:r>
-      <w:r>
-        <w:t>,</w:t>
-      </w:r>
-      <w:r>
-        <w:t xml:space="preserve"> on the next page </w:t>
-      </w:r>
-      <w:r>
-        <w:t>to see how various systems are expected to be affected by climate change</w:t>
-      </w:r>
-      <w:r>
-        <w:t>.</w:t>
-      </w:r>
-    </w:p>
-    <w:p>
-      <w:pPr>
-        <w:ind w:firstLine="720"/>
-      </w:pPr>
-      <w:r>
-        <w:t xml:space="preserve">One significant expected trend to note of is that terrestrial ecosystems across the globe are highly likely to experience attribution from climate change.  In addition, the North American, European, Small Island and Arctic regions are all highly likely to experience </w:t>
-      </w:r>
-      <w:r>
+        <w:rPr>
+          <w:noProof/>
+        </w:rPr>
         <w:lastRenderedPageBreak/>
-        <w:t>attributions from climate change.  It is also clear that nearly all cities, infrastructure, health and (human) wellbeing are expected to experience adverse impacts without notable positives.</w:t>
-      </w:r>
-      <w:r>
-        <w:t xml:space="preserve">  Based on the</w:t>
-      </w:r>
-      <w:r>
-        <w:t>se trends, should they come to pass, we can expect that managing these risks will involve deciding whether to prioritize human systems or ecosystems.</w:t>
-      </w:r>
-    </w:p>
-    <w:p>
-      <w:pPr>
-        <w:ind w:firstLine="720"/>
-      </w:pPr>
-      <w:r>
         <w:drawing>
           <wp:inline distT="0" distB="0" distL="0" distR="0" wp14:anchorId="4728435D" wp14:editId="53FAEC7E">
             <wp:extent cx="4885899" cy="5948687"/>
@@ -519,11 +470,7 @@
         <w:t xml:space="preserve">particularly </w:t>
       </w:r>
       <w:r>
-        <w:t xml:space="preserve">going to </w:t>
-      </w:r>
-      <w:r>
-        <w:lastRenderedPageBreak/>
-        <w:t>become increasingly strained for availabilit</w:t>
+        <w:t>going to become increasingly strained for availabilit</w:t>
       </w:r>
       <w:r>
         <w:t>y</w:t>
@@ -570,6 +517,7 @@
         <w:ind w:firstLine="720"/>
       </w:pPr>
       <w:r>
+        <w:lastRenderedPageBreak/>
         <w:t xml:space="preserve">A particular example of </w:t>
       </w:r>
       <w:r>
@@ -612,7 +560,31 @@
         <w:t xml:space="preserve">(MMDC) </w:t>
       </w:r>
       <w:r>
-        <w:t>employs various larval controls such as Bacillus thuringiensis isrealensis (Bti), methoprene and Spinosad [9]</w:t>
+        <w:t xml:space="preserve">employs various larval controls such as Bacillus thuringiensis </w:t>
+      </w:r>
+      <w:proofErr w:type="spellStart"/>
+      <w:r>
+        <w:t>isrealensis</w:t>
+      </w:r>
+      <w:proofErr w:type="spellEnd"/>
+      <w:r>
+        <w:t xml:space="preserve"> (</w:t>
+      </w:r>
+      <w:proofErr w:type="spellStart"/>
+      <w:r>
+        <w:t>Bti</w:t>
+      </w:r>
+      <w:proofErr w:type="spellEnd"/>
+      <w:r>
+        <w:t xml:space="preserve">), </w:t>
+      </w:r>
+      <w:proofErr w:type="spellStart"/>
+      <w:r>
+        <w:t>methoprene</w:t>
+      </w:r>
+      <w:proofErr w:type="spellEnd"/>
+      <w:r>
+        <w:t xml:space="preserve"> and Spinosad [9]</w:t>
       </w:r>
       <w:r>
         <w:t>.</w:t>
@@ -688,8 +660,13 @@
       <w:r>
         <w:t xml:space="preserve">At the same time, attempting to control mosquito populations can disturb the freshwater food webs they tend to be a part of if deployment isn’t methodical.  For example, </w:t>
       </w:r>
-      <w:r>
-        <w:t>Bti presents risks to chironomid larvae as well</w:t>
+      <w:proofErr w:type="spellStart"/>
+      <w:r>
+        <w:t>Bti</w:t>
+      </w:r>
+      <w:proofErr w:type="spellEnd"/>
+      <w:r>
+        <w:t xml:space="preserve"> presents risks to chironomid larvae as well</w:t>
       </w:r>
       <w:r>
         <w:t xml:space="preserve"> as to mosquito larvae [5].  Chironomids </w:t>
@@ -701,7 +678,15 @@
         <w:t>s</w:t>
       </w:r>
       <w:r>
-        <w:t>.  Deploying too much Bti risks significantly reducing the chironomid species and thus doing more harm to the environment.</w:t>
+        <w:t xml:space="preserve">.  Deploying too much </w:t>
+      </w:r>
+      <w:proofErr w:type="spellStart"/>
+      <w:r>
+        <w:t>Bti</w:t>
+      </w:r>
+      <w:proofErr w:type="spellEnd"/>
+      <w:r>
+        <w:t xml:space="preserve"> risks significantly reducing the chironomid species and thus doing more harm to the environment.</w:t>
       </w:r>
       <w:r>
         <w:t xml:space="preserve">  </w:t>
@@ -734,40 +719,1063 @@
         <w:t>.</w:t>
       </w:r>
       <w:r>
-        <w:t xml:space="preserve">  A successful deployment framework for mosquito controls will thus be deployed over a familiar seasonal landscape, with accurate identification of the targeted areas and a measured volume of the control deployed.</w:t>
+        <w:t xml:space="preserve">  A successful deployment framework for mosquito controls will </w:t>
+      </w:r>
+      <w:r>
+        <w:t>need to</w:t>
+      </w:r>
+      <w:r>
+        <w:t xml:space="preserve"> deploy</w:t>
+      </w:r>
+      <w:r>
+        <w:t xml:space="preserve"> control methods</w:t>
+      </w:r>
+      <w:r>
+        <w:t xml:space="preserve"> over a familiar seasonal landscape, with accurate identification of the targeted areas and a measured volume of the control deployed.</w:t>
       </w:r>
     </w:p>
     <w:p>
-      <w:pPr>
+      <w:r>
         <w:rPr>
           <w:b/>
           <w:bCs/>
         </w:rPr>
-      </w:pPr>
+        <w:t>Literature Review</w:t>
+      </w:r>
       <w:r>
         <w:rPr>
           <w:b/>
           <w:bCs/>
         </w:rPr>
-        <w:t>Literature Review</w:t>
+        <w:br/>
       </w:r>
       <w:r>
         <w:rPr>
           <w:b/>
           <w:bCs/>
         </w:rPr>
-        <w:br/>
-      </w:r>
-      <w:r>
+        <w:tab/>
+      </w:r>
+      <w:r>
+        <w:rPr>
+          <w:u w:val="single"/>
+        </w:rPr>
+        <w:t>Graph</w:t>
+      </w:r>
+      <w:r>
+        <w:rPr>
+          <w:u w:val="single"/>
+        </w:rPr>
+        <w:t>s</w:t>
+      </w:r>
+    </w:p>
+    <w:p>
+      <w:r>
+        <w:tab/>
+      </w:r>
+      <w:r>
+        <w:t xml:space="preserve">Graphs </w:t>
+      </w:r>
+      <w:r>
+        <w:t xml:space="preserve">are an organizational way to arrange data that is defined by </w:t>
+      </w:r>
+      <w:r>
+        <w:t>nodes and vertices</w:t>
+      </w:r>
+      <w:r>
+        <w:t xml:space="preserve"> between nodes.</w:t>
+      </w:r>
+      <w:r>
+        <w:t xml:space="preserve"> </w:t>
+      </w:r>
+      <w:r>
+        <w:t xml:space="preserve"> N</w:t>
+      </w:r>
+      <w:r>
+        <w:t>odes represent data points</w:t>
+      </w:r>
+      <w:r>
+        <w:t xml:space="preserve"> and </w:t>
+      </w:r>
+      <w:r>
+        <w:t xml:space="preserve">can contain multiple attributes that are </w:t>
+      </w:r>
+      <w:r>
+        <w:t>specific to each data point.  V</w:t>
+      </w:r>
+      <w:r>
+        <w:t xml:space="preserve">ertices </w:t>
+      </w:r>
+      <w:r>
+        <w:t xml:space="preserve">represent relationships between nodes and </w:t>
+      </w:r>
+      <w:r>
+        <w:t xml:space="preserve">can contain attributes that are </w:t>
+      </w:r>
+      <w:r>
+        <w:t>exclusively</w:t>
+      </w:r>
+      <w:r>
+        <w:t xml:space="preserve"> tied to the relationship between the connected nodes.  Vertices can also be directional</w:t>
+      </w:r>
+      <w:r>
+        <w:t>, meaning that one node is related to another but not the other way around.</w:t>
+      </w:r>
+      <w:r>
+        <w:t xml:space="preserve">  </w:t>
+      </w:r>
+    </w:p>
+    <w:p>
+      <w:pPr>
+        <w:ind w:firstLine="720"/>
+      </w:pPr>
+      <w:r>
+        <w:t xml:space="preserve">Consider the following </w:t>
+      </w:r>
+      <w:r>
+        <w:t>chart</w:t>
+      </w:r>
+      <w:r>
+        <w:t xml:space="preserve"> from a BBC article detailing the current British Royal Family [10].</w:t>
+      </w:r>
+      <w:r>
+        <w:t xml:space="preserve">  Each family member has a name, a title of royalty, a picture of them when available,</w:t>
+      </w:r>
+      <w:r>
+        <w:t xml:space="preserve"> </w:t>
+      </w:r>
+      <w:r>
+        <w:t xml:space="preserve">lines connecting them based on succession and </w:t>
+      </w:r>
+      <w:r>
+        <w:t>direct descendance, and are positioned by their spouses</w:t>
+      </w:r>
+      <w:r>
+        <w:t>.</w:t>
+      </w:r>
+      <w:r>
+        <w:t xml:space="preserve">  We can translate this to a graph by treating each person in the family as a node, with attributes tied to their name, title</w:t>
+      </w:r>
+      <w:r>
+        <w:t>, if they are in the line of succession,</w:t>
+      </w:r>
+      <w:r>
+        <w:t xml:space="preserve"> and any details contained in the photos.</w:t>
+      </w:r>
+      <w:r>
+        <w:t xml:space="preserve">  Vertices would represent familial </w:t>
+      </w:r>
+      <w:r>
+        <w:lastRenderedPageBreak/>
+        <w:t xml:space="preserve">relationships </w:t>
+      </w:r>
+      <w:r>
+        <w:t>such as</w:t>
+      </w:r>
+      <w:r>
+        <w:t xml:space="preserve"> being a spouse, </w:t>
+      </w:r>
+      <w:r>
+        <w:t>a sibling, who d</w:t>
+      </w:r>
+      <w:r>
+        <w:t>escend</w:t>
+      </w:r>
+      <w:r>
+        <w:t>s from them and who they are descendants from</w:t>
+      </w:r>
+      <w:r>
+        <w:t>.</w:t>
+      </w:r>
+      <w:r>
+        <w:t xml:space="preserve">  Whether a family member is in the line of succession can be represented as </w:t>
+      </w:r>
+      <w:r>
+        <w:t xml:space="preserve">either </w:t>
+      </w:r>
+      <w:r>
+        <w:t xml:space="preserve">an attribute </w:t>
+      </w:r>
+      <w:r>
+        <w:t>on the</w:t>
+      </w:r>
+      <w:r>
+        <w:t xml:space="preserve"> nodes or as an attribute of the </w:t>
+      </w:r>
+      <w:r>
+        <w:t>vertices</w:t>
+      </w:r>
+      <w:r>
+        <w:t>.</w:t>
+      </w:r>
+      <w:r>
+        <w:t xml:space="preserve">  Which</w:t>
+      </w:r>
+      <w:r>
+        <w:t xml:space="preserve"> representation</w:t>
+      </w:r>
+      <w:r>
+        <w:t xml:space="preserve"> </w:t>
+      </w:r>
+      <w:r>
+        <w:t xml:space="preserve">we would prefer </w:t>
+      </w:r>
+      <w:r>
+        <w:t>depends on the intended purpose of the graph we wish to construct.</w:t>
+      </w:r>
+    </w:p>
+    <w:p>
+      <w:pPr>
+        <w:ind w:firstLine="720"/>
+      </w:pPr>
+      <w:r>
+        <w:rPr>
+          <w:noProof/>
+        </w:rPr>
+        <w:drawing>
+          <wp:inline distT="0" distB="0" distL="0" distR="0" wp14:anchorId="5A596A79" wp14:editId="19ADBE55">
+            <wp:extent cx="4572000" cy="6124575"/>
+            <wp:effectExtent l="0" t="0" r="0" b="9525"/>
+            <wp:docPr id="1060603370" name="Picture 4"/>
+            <wp:cNvGraphicFramePr>
+              <a:graphicFrameLocks xmlns:a="http://schemas.openxmlformats.org/drawingml/2006/main" noChangeAspect="1"/>
+            </wp:cNvGraphicFramePr>
+            <a:graphic xmlns:a="http://schemas.openxmlformats.org/drawingml/2006/main">
+              <a:graphicData uri="http://schemas.openxmlformats.org/drawingml/2006/picture">
+                <pic:pic xmlns:pic="http://schemas.openxmlformats.org/drawingml/2006/picture">
+                  <pic:nvPicPr>
+                    <pic:cNvPr id="0" name="Picture 2"/>
+                    <pic:cNvPicPr>
+                      <a:picLocks noChangeAspect="1" noChangeArrowheads="1"/>
+                    </pic:cNvPicPr>
+                  </pic:nvPicPr>
+                  <pic:blipFill>
+                    <a:blip r:embed="rId6">
+                      <a:extLst>
+                        <a:ext uri="{28A0092B-C50C-407E-A947-70E740481C1C}">
+                          <a14:useLocalDpi xmlns:a14="http://schemas.microsoft.com/office/drawing/2010/main" val="0"/>
+                        </a:ext>
+                      </a:extLst>
+                    </a:blip>
+                    <a:srcRect/>
+                    <a:stretch>
+                      <a:fillRect/>
+                    </a:stretch>
+                  </pic:blipFill>
+                  <pic:spPr bwMode="auto">
+                    <a:xfrm>
+                      <a:off x="0" y="0"/>
+                      <a:ext cx="4572000" cy="6124575"/>
+                    </a:xfrm>
+                    <a:prstGeom prst="rect">
+                      <a:avLst/>
+                    </a:prstGeom>
+                    <a:noFill/>
+                  </pic:spPr>
+                </pic:pic>
+              </a:graphicData>
+            </a:graphic>
+          </wp:inline>
+        </w:drawing>
+      </w:r>
+    </w:p>
+    <w:p>
+      <w:pPr>
+        <w:ind w:firstLine="720"/>
+      </w:pPr>
+      <w:r>
+        <w:rPr>
+          <w:u w:val="single"/>
+        </w:rPr>
+        <w:t xml:space="preserve">Graph Intelligence </w:t>
+      </w:r>
+      <w:r>
+        <w:rPr>
+          <w:u w:val="single"/>
+        </w:rPr>
+        <w:t xml:space="preserve">(GI) </w:t>
+      </w:r>
+      <w:r>
+        <w:rPr>
+          <w:u w:val="single"/>
+        </w:rPr>
+        <w:t>Models</w:t>
+      </w:r>
+    </w:p>
+    <w:p>
+      <w:pPr>
+        <w:ind w:firstLine="720"/>
+      </w:pPr>
+      <w:r>
+        <w:t xml:space="preserve">Graph intelligence </w:t>
+      </w:r>
+      <w:r>
+        <w:t xml:space="preserve">(GI) </w:t>
+      </w:r>
+      <w:r>
+        <w:t xml:space="preserve">models treat graphs as input and output either </w:t>
+      </w:r>
+      <w:r>
+        <w:t>node</w:t>
+      </w:r>
+      <w:r>
+        <w:t xml:space="preserve"> predictions, </w:t>
+      </w:r>
+      <w:r>
+        <w:t>vertex</w:t>
+      </w:r>
+      <w:r>
+        <w:t xml:space="preserve"> predictions or graph predictions.</w:t>
+      </w:r>
+      <w:r>
+        <w:t xml:space="preserve">  Node predictions are predictions </w:t>
+      </w:r>
+      <w:r>
+        <w:lastRenderedPageBreak/>
+        <w:t>about attribute changes for each node</w:t>
+      </w:r>
+      <w:r>
+        <w:t xml:space="preserve">.  </w:t>
+      </w:r>
+      <w:r>
+        <w:t>Vertex predictions are predictions on relationships between the existing nodes on the input graphs.</w:t>
+      </w:r>
+      <w:r>
+        <w:t xml:space="preserve">  Graph predictions are where an entire graph is provided as output.</w:t>
+      </w:r>
+    </w:p>
+    <w:p>
+      <w:pPr>
+        <w:ind w:firstLine="720"/>
+      </w:pPr>
+      <w:r>
+        <w:t>Consider the graph</w:t>
+      </w:r>
+      <w:r>
+        <w:t xml:space="preserve"> we </w:t>
+      </w:r>
+      <w:r>
+        <w:t>derive</w:t>
+      </w:r>
+      <w:r>
+        <w:t>d</w:t>
+      </w:r>
+      <w:r>
+        <w:t xml:space="preserve"> from the Royal Family chart above</w:t>
+      </w:r>
+      <w:r>
+        <w:t>, which includes all relationships in the vertices</w:t>
+      </w:r>
+      <w:r>
+        <w:t xml:space="preserve">.  </w:t>
+      </w:r>
+      <w:r>
+        <w:t>A node prediction</w:t>
+      </w:r>
+      <w:r>
+        <w:t xml:space="preserve"> model for this graph</w:t>
+      </w:r>
+      <w:r>
+        <w:t xml:space="preserve"> </w:t>
+      </w:r>
+      <w:r>
+        <w:t>might</w:t>
+      </w:r>
+      <w:r>
+        <w:t xml:space="preserve"> attempt to predict changes in each member’s title</w:t>
+      </w:r>
+      <w:r>
+        <w:t>, name or filling in a picture when none is present.</w:t>
+      </w:r>
+      <w:r>
+        <w:t xml:space="preserve"> </w:t>
+      </w:r>
+      <w:r>
+        <w:t xml:space="preserve"> Meanwhile, a</w:t>
+      </w:r>
+      <w:r>
+        <w:t xml:space="preserve"> vertex prediction </w:t>
+      </w:r>
+      <w:r>
+        <w:t xml:space="preserve">model </w:t>
+      </w:r>
+      <w:r>
+        <w:t>would try to predict changes in the lines of succession</w:t>
+      </w:r>
+      <w:r>
+        <w:t xml:space="preserve"> or whether a divorce was going to happen</w:t>
+      </w:r>
+      <w:r>
+        <w:t xml:space="preserve">.  </w:t>
+      </w:r>
+      <w:r>
+        <w:t>Finally, a</w:t>
+      </w:r>
+      <w:r>
+        <w:t xml:space="preserve"> </w:t>
+      </w:r>
+      <w:r>
+        <w:t>graph model would try to predict changes to the entire family tree</w:t>
+      </w:r>
+      <w:r>
+        <w:t xml:space="preserve"> structure</w:t>
+      </w:r>
+      <w:r>
+        <w:t>, such as family members getting removed</w:t>
+      </w:r>
+      <w:r>
+        <w:t xml:space="preserve">, </w:t>
+      </w:r>
+      <w:r>
+        <w:t>new children being born</w:t>
+      </w:r>
+      <w:r>
+        <w:t>, or whether the line of succession has effectively ended.</w:t>
+      </w:r>
+    </w:p>
+    <w:p>
+      <w:r>
+        <w:rPr>
+          <w:noProof/>
+        </w:rPr>
+        <w:drawing>
+          <wp:inline distT="0" distB="0" distL="0" distR="0" wp14:anchorId="18D1F2D1" wp14:editId="6A4F53EF">
+            <wp:extent cx="5943600" cy="1762760"/>
+            <wp:effectExtent l="0" t="0" r="0" b="8890"/>
+            <wp:docPr id="801704549" name="Picture 1"/>
+            <wp:cNvGraphicFramePr>
+              <a:graphicFrameLocks xmlns:a="http://schemas.openxmlformats.org/drawingml/2006/main" noChangeAspect="1"/>
+            </wp:cNvGraphicFramePr>
+            <a:graphic xmlns:a="http://schemas.openxmlformats.org/drawingml/2006/main">
+              <a:graphicData uri="http://schemas.openxmlformats.org/drawingml/2006/picture">
+                <pic:pic xmlns:pic="http://schemas.openxmlformats.org/drawingml/2006/picture">
+                  <pic:nvPicPr>
+                    <pic:cNvPr id="801704549" name=""/>
+                    <pic:cNvPicPr/>
+                  </pic:nvPicPr>
+                  <pic:blipFill>
+                    <a:blip r:embed="rId7"/>
+                    <a:stretch>
+                      <a:fillRect/>
+                    </a:stretch>
+                  </pic:blipFill>
+                  <pic:spPr>
+                    <a:xfrm>
+                      <a:off x="0" y="0"/>
+                      <a:ext cx="5943600" cy="1762760"/>
+                    </a:xfrm>
+                    <a:prstGeom prst="rect">
+                      <a:avLst/>
+                    </a:prstGeom>
+                  </pic:spPr>
+                </pic:pic>
+              </a:graphicData>
+            </a:graphic>
+          </wp:inline>
+        </w:drawing>
+      </w:r>
+    </w:p>
+    <w:p>
+      <w:pPr>
+        <w:ind w:firstLine="720"/>
+      </w:pPr>
+      <w:r>
+        <w:t>GI models are trained through an iterative process</w:t>
+      </w:r>
+      <w:r>
+        <w:t xml:space="preserve">, which is illustrated </w:t>
+      </w:r>
+      <w:r>
+        <w:t>in Figure 3</w:t>
+      </w:r>
+      <w:r>
+        <w:t xml:space="preserve"> </w:t>
+      </w:r>
+      <w:r>
+        <w:t>shown above</w:t>
+      </w:r>
+      <w:r>
+        <w:t xml:space="preserve"> [11]</w:t>
+      </w:r>
+      <w:r>
+        <w:t xml:space="preserve">.  Each iteration starts with a subgraph being sampled from the main graph.  The subgraph is </w:t>
+      </w:r>
+      <w:r>
+        <w:t xml:space="preserve">then </w:t>
+      </w:r>
+      <w:r>
+        <w:t xml:space="preserve">aggregated </w:t>
+      </w:r>
+      <w:r>
+        <w:t xml:space="preserve">into a representation vector </w:t>
+      </w:r>
+      <w:r>
+        <w:t xml:space="preserve">based on the neighbors of the sampled vertices.  Neighbors for a vertex </w:t>
+      </w:r>
+      <w:r>
+        <w:t>can be</w:t>
+      </w:r>
+      <w:r>
+        <w:t xml:space="preserve"> the nodes that form the vertex and the nodes connected to those initial nodes by other vertices</w:t>
+      </w:r>
+      <w:r>
+        <w:t>.  Wh</w:t>
+      </w:r>
+      <w:r>
+        <w:t xml:space="preserve">ich details </w:t>
+      </w:r>
+      <w:r>
+        <w:t xml:space="preserve">are </w:t>
+      </w:r>
+      <w:r>
+        <w:t>included in the representation vector</w:t>
+      </w:r>
+      <w:r>
+        <w:t xml:space="preserve"> is based on shared attributes between the initial nodes</w:t>
+      </w:r>
+      <w:r>
+        <w:t>, and specifications from th</w:t>
+      </w:r>
+      <w:r>
+        <w:t>e user(s)</w:t>
+      </w:r>
+      <w:r>
+        <w:t>.</w:t>
+      </w:r>
+      <w:r>
+        <w:t xml:space="preserve">  Finally, the aggregation then gets passed through a neural network to update the representation</w:t>
+      </w:r>
+      <w:r>
+        <w:t xml:space="preserve"> to the desired output.  If the output passes enough cutoff requirements for the neural network, then it is returned as the model.  Otherwise, the iterative sampling starts over from the sampling step.</w:t>
+      </w:r>
+    </w:p>
+    <w:p>
+      <w:pPr>
+        <w:ind w:firstLine="720"/>
+      </w:pPr>
+      <w:r>
+        <w:rPr>
+          <w:u w:val="single"/>
+        </w:rPr>
+        <w:t xml:space="preserve">Edge </w:t>
+      </w:r>
+      <w:r>
+        <w:rPr>
+          <w:u w:val="single"/>
+        </w:rPr>
+        <w:t>Computing</w:t>
+      </w:r>
+      <w:r>
+        <w:rPr>
+          <w:u w:val="single"/>
+        </w:rPr>
+        <w:t xml:space="preserve"> and Networks</w:t>
+      </w:r>
+    </w:p>
+    <w:p>
+      <w:r>
+        <w:tab/>
+      </w:r>
+      <w:r>
+        <w:t>Edge networks are networks of computers that are organized to manage limited or changing resources without a centralized resource.</w:t>
+      </w:r>
+      <w:r>
+        <w:t xml:space="preserve">  </w:t>
+      </w:r>
+      <w:r>
+        <w:t>Computers</w:t>
+      </w:r>
+      <w:r>
+        <w:t xml:space="preserve"> in an edge network </w:t>
+      </w:r>
+      <w:r>
+        <w:t xml:space="preserve">vary widely in computing or memory </w:t>
+      </w:r>
+      <w:r>
+        <w:t>capacity and</w:t>
+      </w:r>
+      <w:r>
+        <w:t xml:space="preserve"> are dispersed geographically</w:t>
+      </w:r>
+      <w:r>
+        <w:t xml:space="preserve"> with multiple</w:t>
+      </w:r>
+      <w:r>
+        <w:t xml:space="preserve"> changing</w:t>
+      </w:r>
+      <w:r>
+        <w:t xml:space="preserve"> resource constraints that are a result of their environment</w:t>
+      </w:r>
+      <w:r>
+        <w:t>.</w:t>
+      </w:r>
+      <w:r>
+        <w:t xml:space="preserve">  </w:t>
+      </w:r>
+      <w:r>
+        <w:t xml:space="preserve">Edge networks are designed with the understanding that </w:t>
+      </w:r>
+      <w:r>
+        <w:t>there</w:t>
+      </w:r>
+      <w:r>
+        <w:t xml:space="preserve"> is no </w:t>
+      </w:r>
+      <w:r>
+        <w:t xml:space="preserve">guarantee </w:t>
+      </w:r>
+      <w:r>
+        <w:t xml:space="preserve">of a </w:t>
+      </w:r>
+      <w:r>
+        <w:t xml:space="preserve">consistent connection between </w:t>
+      </w:r>
+      <w:r>
+        <w:t xml:space="preserve">any of its </w:t>
+      </w:r>
+      <w:r>
+        <w:t>devices</w:t>
+      </w:r>
+      <w:r>
+        <w:t xml:space="preserve">.  </w:t>
+      </w:r>
+      <w:r>
+        <w:t xml:space="preserve">To resolve this, devices on the network are categorized based </w:t>
+      </w:r>
+      <w:r>
+        <w:lastRenderedPageBreak/>
+        <w:t>on their processing capacity.</w:t>
+      </w:r>
+      <w:r>
+        <w:t xml:space="preserve"> </w:t>
+      </w:r>
+      <w:r>
+        <w:t xml:space="preserve"> End devices, which are at the ends of the network, typically contain simple devices unable to handle high-cost processing such as </w:t>
+      </w:r>
+      <w:r>
+        <w:t>sensors</w:t>
+      </w:r>
+      <w:r>
+        <w:t xml:space="preserve"> </w:t>
+      </w:r>
+      <w:r>
+        <w:t xml:space="preserve">and </w:t>
+      </w:r>
+      <w:r>
+        <w:t>mobile devices</w:t>
+      </w:r>
+      <w:r>
+        <w:t xml:space="preserve">.  Meanwhile edge devices can handle collecting data or simple processed information as the end devices connect and disconnect.  Edge devices typically include </w:t>
+      </w:r>
+      <w:r>
+        <w:t>micro data centers</w:t>
+      </w:r>
+      <w:r>
+        <w:t>.</w:t>
+      </w:r>
+      <w:r>
+        <w:t xml:space="preserve"> </w:t>
+      </w:r>
+      <w:r>
+        <w:t xml:space="preserve"> Edge cloud devices are typically at the top of the network, and handle the heavy processing expected to be dispersed to the edge devices.  R</w:t>
+      </w:r>
+      <w:r>
+        <w:t>obots and vehicles</w:t>
+      </w:r>
+      <w:r>
+        <w:t xml:space="preserve"> can be categorized as either end or edge devices, depending on their function</w:t>
+      </w:r>
+      <w:r>
+        <w:t>.</w:t>
+      </w:r>
+      <w:r>
+        <w:t xml:space="preserve">  </w:t>
+      </w:r>
+      <w:r>
+        <w:t>Given the</w:t>
+      </w:r>
+      <w:r>
+        <w:t xml:space="preserve"> wide variety of computer types on </w:t>
+      </w:r>
+      <w:r>
+        <w:t>an edge</w:t>
+      </w:r>
+      <w:r>
+        <w:t xml:space="preserve"> network</w:t>
+      </w:r>
+      <w:r>
+        <w:t>,</w:t>
+      </w:r>
+      <w:r>
+        <w:t xml:space="preserve"> </w:t>
+      </w:r>
+      <w:r>
+        <w:t>the</w:t>
+      </w:r>
+      <w:r>
+        <w:t xml:space="preserve"> software network</w:t>
+      </w:r>
+      <w:r>
+        <w:t>ing</w:t>
+      </w:r>
+      <w:r>
+        <w:t xml:space="preserve"> them </w:t>
+      </w:r>
+      <w:r>
+        <w:t xml:space="preserve">is often required </w:t>
+      </w:r>
+      <w:r>
+        <w:t>to be</w:t>
+      </w:r>
+      <w:r>
+        <w:t xml:space="preserve"> some combination of</w:t>
+      </w:r>
+      <w:r>
+        <w:t xml:space="preserve"> cross-platform</w:t>
+      </w:r>
+      <w:r>
+        <w:t xml:space="preserve"> capable</w:t>
+      </w:r>
+      <w:r>
+        <w:t>, cross-protocol</w:t>
+      </w:r>
+      <w:r>
+        <w:t xml:space="preserve"> capable</w:t>
+      </w:r>
+      <w:r>
+        <w:t>, language</w:t>
+      </w:r>
+      <w:r>
+        <w:t>-</w:t>
+      </w:r>
+      <w:r>
+        <w:t>agnostic</w:t>
+      </w:r>
+      <w:r>
+        <w:t xml:space="preserve"> and </w:t>
+      </w:r>
+      <w:r>
+        <w:t>resource-efficient</w:t>
+      </w:r>
+      <w:r>
+        <w:t>.</w:t>
+      </w:r>
+    </w:p>
+    <w:p>
+      <w:r>
+        <w:tab/>
+      </w:r>
+      <w:r>
+        <w:rPr>
+          <w:u w:val="single"/>
+        </w:rPr>
+        <w:t xml:space="preserve">Edge </w:t>
+      </w:r>
+      <w:r>
+        <w:rPr>
+          <w:u w:val="single"/>
+        </w:rPr>
+        <w:t xml:space="preserve">Graph </w:t>
+      </w:r>
+      <w:r>
+        <w:rPr>
+          <w:u w:val="single"/>
+        </w:rPr>
+        <w:t>Intelligence</w:t>
+      </w:r>
+      <w:r>
+        <w:rPr>
+          <w:u w:val="single"/>
+        </w:rPr>
+        <w:t xml:space="preserve"> (EGI)</w:t>
+      </w:r>
+    </w:p>
+    <w:p>
+      <w:r>
+        <w:tab/>
+      </w:r>
+      <w:r>
+        <w:t xml:space="preserve">Edge networks </w:t>
+      </w:r>
+      <w:r>
+        <w:t xml:space="preserve">that utilize artificial intelligence (AI) are instances of edge intelligence, with EGI being the case where graphs are treated as the input and define the output.  </w:t>
+      </w:r>
+      <w:r>
+        <w:t>One</w:t>
+      </w:r>
+      <w:r>
+        <w:t xml:space="preserve"> key advantage</w:t>
+      </w:r>
+      <w:r>
+        <w:t xml:space="preserve"> of edge intelligence is that data centers are freed from storing large amounts of data and handling high amounts of traffic.  The edge devices can handle the traffic and data for</w:t>
+      </w:r>
+      <w:r>
+        <w:t xml:space="preserve"> end devices</w:t>
+      </w:r>
+      <w:r>
+        <w:t xml:space="preserve"> connected to it</w:t>
+      </w:r>
+      <w:r>
+        <w:t xml:space="preserve">, freeing specific tasks from the cloud servers.  </w:t>
+      </w:r>
+      <w:r>
+        <w:t>Meanwhile, t</w:t>
+      </w:r>
+      <w:r>
+        <w:t xml:space="preserve">he cloud devices </w:t>
+      </w:r>
+      <w:r>
+        <w:t>p</w:t>
+      </w:r>
+      <w:r>
+        <w:t xml:space="preserve">rovide </w:t>
+      </w:r>
+      <w:r>
+        <w:t xml:space="preserve">more general </w:t>
+      </w:r>
+      <w:r>
+        <w:t>services for the edge devices</w:t>
+      </w:r>
+      <w:r>
+        <w:t xml:space="preserve">, preventing edge network devices from </w:t>
+      </w:r>
+      <w:r>
+        <w:t>having</w:t>
+      </w:r>
+      <w:r>
+        <w:t xml:space="preserve"> to </w:t>
+      </w:r>
+      <w:r>
+        <w:t xml:space="preserve">attempt to </w:t>
+      </w:r>
+      <w:r>
+        <w:t>communicate with each other all at once.</w:t>
+      </w:r>
+    </w:p>
+    <w:p>
+      <w:r>
+        <w:tab/>
+        <w:t xml:space="preserve">In the </w:t>
+      </w:r>
+      <w:r>
+        <w:rPr>
+          <w:i/>
+          <w:iCs/>
+        </w:rPr>
+        <w:t>Edge IG: Reciprocally Empowering Edge Networks with Graph Intelligence</w:t>
+      </w:r>
+      <w:r>
+        <w:t xml:space="preserve"> study from Zeng et al [11], EGI was classified into 6 different levels depending on where the AI was applied within the edge network</w:t>
+      </w:r>
+      <w:r>
+        <w:t xml:space="preserve"> and how much awareness of the graph was utilized in </w:t>
+      </w:r>
+      <w:r>
+        <w:t>the</w:t>
+      </w:r>
+      <w:r>
+        <w:t xml:space="preserve"> training process</w:t>
+      </w:r>
+      <w:r>
+        <w:t xml:space="preserve">.  Applications of AI that </w:t>
+      </w:r>
+      <w:r>
+        <w:t>are</w:t>
+      </w:r>
+      <w:r>
+        <w:t xml:space="preserve"> performed </w:t>
+      </w:r>
+      <w:r>
+        <w:t xml:space="preserve">on the end devices </w:t>
+      </w:r>
+      <w:r>
+        <w:t xml:space="preserve">alone </w:t>
+      </w:r>
+      <w:r>
+        <w:t xml:space="preserve">are handled at levels 0 (not even aware of a graph structure) </w:t>
+      </w:r>
+      <w:r>
+        <w:t>through</w:t>
+      </w:r>
+      <w:r>
+        <w:t xml:space="preserve"> 2 (GI)</w:t>
+      </w:r>
+      <w:r>
+        <w:t xml:space="preserve">.  </w:t>
+      </w:r>
+      <w:r>
+        <w:t>Meanwhile l</w:t>
+      </w:r>
+      <w:r>
+        <w:t>evel</w:t>
+      </w:r>
+      <w:r>
+        <w:t xml:space="preserve">s 3 </w:t>
+      </w:r>
+      <w:r>
+        <w:t xml:space="preserve">(cloud and end devices) </w:t>
+      </w:r>
+      <w:r>
+        <w:t>through</w:t>
+      </w:r>
+      <w:r>
+        <w:t xml:space="preserve"> 5 </w:t>
+      </w:r>
+      <w:r>
+        <w:t>(</w:t>
+      </w:r>
+      <w:r>
+        <w:t>the full network connection</w:t>
+      </w:r>
+      <w:r>
+        <w:t xml:space="preserve">) </w:t>
+      </w:r>
+      <w:r>
+        <w:t xml:space="preserve">involve </w:t>
+      </w:r>
+      <w:r>
+        <w:t>a</w:t>
+      </w:r>
+      <w:r>
+        <w:t xml:space="preserve">pplications </w:t>
+      </w:r>
+      <w:r>
+        <w:t xml:space="preserve">that </w:t>
+      </w:r>
+      <w:r>
+        <w:t xml:space="preserve">require interactions between edge </w:t>
+      </w:r>
+      <w:r>
+        <w:t xml:space="preserve">and cloud </w:t>
+      </w:r>
+      <w:r>
+        <w:t>devices to train model</w:t>
+      </w:r>
+      <w:r>
+        <w:t>s</w:t>
+      </w:r>
+      <w:r>
+        <w:t xml:space="preserve"> with full knowledge</w:t>
+      </w:r>
+      <w:r>
+        <w:t xml:space="preserve"> of the graph</w:t>
+      </w:r>
+      <w:r>
+        <w:t xml:space="preserve"> data itself</w:t>
+      </w:r>
+      <w:r>
+        <w:t>.</w:t>
+      </w:r>
+    </w:p>
+    <w:p>
+      <w:pPr>
+        <w:ind w:firstLine="720"/>
+      </w:pPr>
+      <w:r>
+        <w:t xml:space="preserve">Consider how </w:t>
+      </w:r>
+      <w:r>
+        <w:t>a self-driving vehicle</w:t>
+      </w:r>
+      <w:r>
+        <w:t xml:space="preserve"> may utilize each level.  </w:t>
+      </w:r>
+      <w:r>
+        <w:t>L</w:t>
+      </w:r>
+      <w:r>
+        <w:t xml:space="preserve">ocal activities tied to computer vision </w:t>
+      </w:r>
+      <w:r>
+        <w:t xml:space="preserve">and movement through dynamic terrain </w:t>
+      </w:r>
+      <w:r>
+        <w:t xml:space="preserve">would </w:t>
+      </w:r>
+      <w:r>
+        <w:t>be classified as</w:t>
+      </w:r>
+      <w:r>
+        <w:t xml:space="preserve"> levels 0 through </w:t>
+      </w:r>
+      <w:r>
+        <w:t>2.</w:t>
+      </w:r>
+      <w:r>
+        <w:t xml:space="preserve">  Finding an optimal </w:t>
+      </w:r>
+      <w:r>
+        <w:t xml:space="preserve">distance/minimally difficult </w:t>
+      </w:r>
+      <w:r>
+        <w:t>path through a</w:t>
+      </w:r>
+      <w:r>
+        <w:t xml:space="preserve"> global</w:t>
+      </w:r>
+      <w:r>
+        <w:t xml:space="preserve"> environment would be level 3, where GI training is handled by a </w:t>
+      </w:r>
+      <w:r>
+        <w:t xml:space="preserve">single </w:t>
+      </w:r>
+      <w:r>
+        <w:t>cloud or edge device.</w:t>
+      </w:r>
+      <w:r>
+        <w:t xml:space="preserve">  Level 4 would involve training</w:t>
+      </w:r>
+      <w:r>
+        <w:t xml:space="preserve"> GI</w:t>
+      </w:r>
+      <w:r>
+        <w:t xml:space="preserve"> across</w:t>
+      </w:r>
+      <w:r>
+        <w:t xml:space="preserve"> multiple </w:t>
+      </w:r>
+      <w:r>
+        <w:t>edge devices</w:t>
+      </w:r>
+      <w:r>
+        <w:t xml:space="preserve">, such as a model to predict traffic changes across </w:t>
+      </w:r>
+      <w:r>
+        <w:t>cities</w:t>
+      </w:r>
+      <w:r>
+        <w:t xml:space="preserve"> where each city monitors its own traffic</w:t>
+      </w:r>
+      <w:r>
+        <w:t>.</w:t>
+      </w:r>
+      <w:r>
+        <w:t xml:space="preserve">  Finally, a dynamic weather forecast </w:t>
+      </w:r>
+      <w:r>
+        <w:t>t</w:t>
+      </w:r>
+      <w:r>
+        <w:t xml:space="preserve">hat requires all edge devices to train together </w:t>
+      </w:r>
+      <w:r>
+        <w:t>using all their own data would be an example of a level 5 EGI</w:t>
+      </w:r>
+      <w:r>
+        <w:t xml:space="preserve"> framework</w:t>
+      </w:r>
+      <w:r>
+        <w:t>.</w:t>
+      </w:r>
+    </w:p>
+    <w:p>
+      <w:pPr>
+        <w:ind w:firstLine="720"/>
         <w:rPr>
           <w:b/>
           <w:bCs/>
         </w:rPr>
-        <w:tab/>
-      </w:r>
-      <w:r>
-        <w:t>[Include sources for methods to study here, including edge processing and real-world models]</w:t>
-      </w:r>
+      </w:pPr>
     </w:p>
     <w:p>
       <w:r>
@@ -801,7 +1809,7 @@
         <w:t>While this does prevent the person from being too exposed to the mosquito swarm, the methodology</w:t>
       </w:r>
       <w:r>
-        <w:t>…</w:t>
+        <w:t xml:space="preserve"> still requires one person per drone deployment.  Providing an edge network alternative may enable multiple drones to be deployed across several locations simultaneously.</w:t>
       </w:r>
     </w:p>
     <w:p>
@@ -809,8 +1817,7 @@
         <w:ind w:firstLine="720"/>
       </w:pPr>
       <w:r>
-        <w:lastRenderedPageBreak/>
-        <w:t>Meanwhile the existing edge processing and real-world models tend to not be focused on a task as specific as identifying mosquito populations or nesting areas…</w:t>
+        <w:t>We will be able to comment on specific EGI and edge network limitations once we delve further into the algorithms and data we will be using for training.</w:t>
       </w:r>
     </w:p>
     <w:p>
@@ -832,111 +1839,61 @@
         <w:tab/>
       </w:r>
       <w:r>
-        <w:t xml:space="preserve">Should we find an ideal or obvious </w:t>
-      </w:r>
-      <w:r>
-        <w:t xml:space="preserve">spatial learning </w:t>
-      </w:r>
-      <w:r>
-        <w:t xml:space="preserve">method for the drones to adopt, then we shall conduct a simulated experiment in which the drones need to correctly identify targets for deploying the anti-mosquito </w:t>
-      </w:r>
-      <w:r>
-        <w:t>control</w:t>
-      </w:r>
-      <w:r>
-        <w:t>, approaching the</w:t>
-      </w:r>
-      <w:r>
-        <w:t xml:space="preserve"> target</w:t>
-      </w:r>
-      <w:r>
-        <w:t xml:space="preserve">, </w:t>
-      </w:r>
-      <w:r>
-        <w:t xml:space="preserve">and deploying the control method on </w:t>
-      </w:r>
-      <w:r>
-        <w:t xml:space="preserve">said </w:t>
-      </w:r>
-      <w:r>
-        <w:t>target</w:t>
-      </w:r>
-      <w:r>
-        <w:t xml:space="preserve"> in an appropriate manner</w:t>
-      </w:r>
-      <w:r>
-        <w:t xml:space="preserve">. </w:t>
-      </w:r>
-      <w:r>
-        <w:t xml:space="preserve">The simulations will also be timed </w:t>
-      </w:r>
-      <w:r>
-        <w:t>based on an approximation of the drone’s battery life</w:t>
-      </w:r>
-      <w:r>
-        <w:t>, with time depleting based on the actions the drones tak</w:t>
-      </w:r>
-      <w:r>
-        <w:t>e</w:t>
-      </w:r>
-      <w:r>
-        <w:t xml:space="preserve">, </w:t>
-      </w:r>
-      <w:r>
-        <w:t xml:space="preserve">how far </w:t>
-      </w:r>
-      <w:r>
-        <w:t>they travel, and at what elevation do they hover</w:t>
-      </w:r>
-      <w:r>
-        <w:t>.</w:t>
-      </w:r>
-    </w:p>
-    <w:p>
-      <w:pPr>
-        <w:ind w:firstLine="720"/>
-      </w:pPr>
-      <w:r>
         <w:t xml:space="preserve">Evaluating </w:t>
       </w:r>
       <w:r>
         <w:t>each</w:t>
       </w:r>
       <w:r>
-        <w:t xml:space="preserve"> method’s success</w:t>
-      </w:r>
-      <w:r>
-        <w:t xml:space="preserve"> rate</w:t>
-      </w:r>
-      <w:r>
-        <w:t xml:space="preserve"> will be based </w:t>
+        <w:t xml:space="preserve"> method’s </w:t>
+      </w:r>
+      <w:r>
+        <w:t xml:space="preserve">performance </w:t>
+      </w:r>
+      <w:r>
+        <w:t xml:space="preserve">will be based </w:t>
       </w:r>
       <w:r>
         <w:t xml:space="preserve">on </w:t>
       </w:r>
       <w:r>
-        <w:t xml:space="preserve">multiple factors.  The number of false positives for deploying the control can inform us about the likelihood of harming the environment.  </w:t>
-      </w:r>
-      <w:r>
-        <w:t xml:space="preserve">A failed deployment can be counted as either deploying too much of the control or missing the target.  </w:t>
-      </w:r>
-      <w:r>
-        <w:t>True negatives occur when a population is present but never identified</w:t>
-      </w:r>
-      <w:r>
-        <w:t xml:space="preserve">, </w:t>
-      </w:r>
-      <w:r>
-        <w:t xml:space="preserve">targeted or deployed against within the time limit.  Any of these instances are </w:t>
-      </w:r>
-      <w:r>
-        <w:t xml:space="preserve">indicative of a </w:t>
-      </w:r>
-      <w:r>
-        <w:t>waste of resources</w:t>
-      </w:r>
-      <w:r>
-        <w:t xml:space="preserve">.  </w:t>
+        <w:t xml:space="preserve">multiple factors.  The number of false positives </w:t>
+      </w:r>
+      <w:r>
+        <w:t xml:space="preserve">where a nest is incorrectly identified provides insight into how likely the method is to unnecessarily </w:t>
+      </w:r>
+      <w:r>
+        <w:t xml:space="preserve">harm the environment.  </w:t>
+      </w:r>
+      <w:r>
+        <w:t xml:space="preserve">Failing to find a nest before the drones need to be recalled for battery consumption would </w:t>
+      </w:r>
+      <w:r>
+        <w:t>constitute either a t</w:t>
+      </w:r>
+      <w:r>
+        <w:t>rue negative</w:t>
+      </w:r>
+      <w:r>
+        <w:t>, or accurately determining no nest is present.</w:t>
+      </w:r>
+      <w:r>
+        <w:t xml:space="preserve">  </w:t>
+      </w:r>
+      <w:r>
+        <w:t xml:space="preserve">If there was a nest, then </w:t>
+      </w:r>
+      <w:r>
+        <w:t>the robot</w:t>
+      </w:r>
+      <w:r>
+        <w:t xml:space="preserve"> present</w:t>
+      </w:r>
+      <w:r>
+        <w:t>ed</w:t>
+      </w:r>
+      <w:r>
+        <w:t xml:space="preserve"> a true negative that entails risk of letting populations grow.  </w:t>
       </w:r>
       <w:r>
         <w:t xml:space="preserve">Measuring both </w:t>
@@ -1023,8 +1980,7 @@
       </w:tblPr>
       <w:tblGrid>
         <w:gridCol w:w="1525"/>
-        <w:gridCol w:w="3870"/>
-        <w:gridCol w:w="3955"/>
+        <w:gridCol w:w="7825"/>
       </w:tblGrid>
       <w:tr>
         <w:trPr>
@@ -1051,7 +2007,7 @@
         </w:tc>
         <w:tc>
           <w:tcPr>
-            <w:tcW w:w="3870" w:type="dxa"/>
+            <w:tcW w:w="7825" w:type="dxa"/>
           </w:tcPr>
           <w:p>
             <w:pPr>
@@ -1059,27 +2015,7 @@
               <w:cnfStyle w:val="100000000000" w:firstRow="1" w:lastRow="0" w:firstColumn="0" w:lastColumn="0" w:oddVBand="0" w:evenVBand="0" w:oddHBand="0" w:evenHBand="0" w:firstRowFirstColumn="0" w:firstRowLastColumn="0" w:lastRowFirstColumn="0" w:lastRowLastColumn="0"/>
             </w:pPr>
             <w:r>
-              <w:t>Milestone (</w:t>
-            </w:r>
-            <w:r>
-              <w:t>Experiment</w:t>
-            </w:r>
-            <w:r>
-              <w:t xml:space="preserve"> Option)</w:t>
-            </w:r>
-          </w:p>
-        </w:tc>
-        <w:tc>
-          <w:tcPr>
-            <w:tcW w:w="3955" w:type="dxa"/>
-          </w:tcPr>
-          <w:p>
-            <w:pPr>
-              <w:jc w:val="center"/>
-              <w:cnfStyle w:val="100000000000" w:firstRow="1" w:lastRow="0" w:firstColumn="0" w:lastColumn="0" w:oddVBand="0" w:evenVBand="0" w:oddHBand="0" w:evenHBand="0" w:firstRowFirstColumn="0" w:firstRowLastColumn="0" w:lastRowFirstColumn="0" w:lastRowLastColumn="0"/>
-            </w:pPr>
-            <w:r>
-              <w:t>Milestone (Survey Option)</w:t>
+              <w:t>Milestone</w:t>
             </w:r>
           </w:p>
         </w:tc>
@@ -1098,14 +2034,16 @@
               <w:jc w:val="center"/>
             </w:pPr>
             <w:r>
-              <w:t>3/12</w:t>
+              <w:t>3/1</w:t>
+            </w:r>
+            <w:r>
+              <w:t>9</w:t>
             </w:r>
           </w:p>
         </w:tc>
         <w:tc>
           <w:tcPr>
             <w:tcW w:w="7825" w:type="dxa"/>
-            <w:gridSpan w:val="2"/>
           </w:tcPr>
           <w:p>
             <w:pPr>
@@ -1113,16 +2051,19 @@
               <w:cnfStyle w:val="000000100000" w:firstRow="0" w:lastRow="0" w:firstColumn="0" w:lastColumn="0" w:oddVBand="0" w:evenVBand="0" w:oddHBand="1" w:evenHBand="0" w:firstRowFirstColumn="0" w:firstRowLastColumn="0" w:lastRowFirstColumn="0" w:lastRowLastColumn="0"/>
             </w:pPr>
             <w:r>
-              <w:t xml:space="preserve">Decide </w:t>
+              <w:t>Obtain</w:t>
             </w:r>
             <w:r>
-              <w:t xml:space="preserve">to Either Experiment with One or Two Methods </w:t>
+              <w:t>ed</w:t>
             </w:r>
             <w:r>
-              <w:t>f</w:t>
+              <w:t xml:space="preserve"> or Create</w:t>
             </w:r>
             <w:r>
-              <w:t>or Mosquito Control, or to Survey Potential Methods Instead</w:t>
+              <w:t>d</w:t>
+            </w:r>
+            <w:r>
+              <w:t xml:space="preserve"> Data for Simulated Environment</w:t>
             </w:r>
           </w:p>
         </w:tc>
@@ -1138,13 +2079,16 @@
               <w:jc w:val="center"/>
             </w:pPr>
             <w:r>
-              <w:t>3/15</w:t>
+              <w:t>3/2</w:t>
+            </w:r>
+            <w:r>
+              <w:t>6</w:t>
             </w:r>
           </w:p>
         </w:tc>
         <w:tc>
           <w:tcPr>
-            <w:tcW w:w="3870" w:type="dxa"/>
+            <w:tcW w:w="7825" w:type="dxa"/>
           </w:tcPr>
           <w:p>
             <w:pPr>
@@ -1152,21 +2096,7 @@
               <w:cnfStyle w:val="000000000000" w:firstRow="0" w:lastRow="0" w:firstColumn="0" w:lastColumn="0" w:oddVBand="0" w:evenVBand="0" w:oddHBand="0" w:evenHBand="0" w:firstRowFirstColumn="0" w:firstRowLastColumn="0" w:lastRowFirstColumn="0" w:lastRowLastColumn="0"/>
             </w:pPr>
             <w:r>
-              <w:t>Obtain Data for Generating Simulated Environment(s)</w:t>
-            </w:r>
-          </w:p>
-        </w:tc>
-        <w:tc>
-          <w:tcPr>
-            <w:tcW w:w="3955" w:type="dxa"/>
-          </w:tcPr>
-          <w:p>
-            <w:pPr>
-              <w:jc w:val="center"/>
-              <w:cnfStyle w:val="000000000000" w:firstRow="0" w:lastRow="0" w:firstColumn="0" w:lastColumn="0" w:oddVBand="0" w:evenVBand="0" w:oddHBand="0" w:evenHBand="0" w:firstRowFirstColumn="0" w:firstRowLastColumn="0" w:lastRowFirstColumn="0" w:lastRowLastColumn="0"/>
-            </w:pPr>
-            <w:r>
-              <w:t>List All Potential Data That Can Be Utilized for Training</w:t>
+              <w:t>Formulated Algorithms for Edge and Near-Edge Training</w:t>
             </w:r>
           </w:p>
         </w:tc>
@@ -1185,13 +2115,13 @@
               <w:jc w:val="center"/>
             </w:pPr>
             <w:r>
-              <w:t>3/20</w:t>
+              <w:t>4/2</w:t>
             </w:r>
           </w:p>
         </w:tc>
         <w:tc>
           <w:tcPr>
-            <w:tcW w:w="3870" w:type="dxa"/>
+            <w:tcW w:w="7825" w:type="dxa"/>
           </w:tcPr>
           <w:p>
             <w:pPr>
@@ -1199,24 +2129,7 @@
               <w:cnfStyle w:val="000000100000" w:firstRow="0" w:lastRow="0" w:firstColumn="0" w:lastColumn="0" w:oddVBand="0" w:evenVBand="0" w:oddHBand="1" w:evenHBand="0" w:firstRowFirstColumn="0" w:firstRowLastColumn="0" w:lastRowFirstColumn="0" w:lastRowLastColumn="0"/>
             </w:pPr>
             <w:r>
-              <w:t>Construct Algorithm(s) to Generate Test (and Training) Environments, and Algorithm(s) to Train Drone Decision-Making</w:t>
-            </w:r>
-          </w:p>
-        </w:tc>
-        <w:tc>
-          <w:tcPr>
-            <w:tcW w:w="3955" w:type="dxa"/>
-          </w:tcPr>
-          <w:p>
-            <w:pPr>
-              <w:jc w:val="center"/>
-              <w:cnfStyle w:val="000000100000" w:firstRow="0" w:lastRow="0" w:firstColumn="0" w:lastColumn="0" w:oddVBand="0" w:evenVBand="0" w:oddHBand="1" w:evenHBand="0" w:firstRowFirstColumn="0" w:firstRowLastColumn="0" w:lastRowFirstColumn="0" w:lastRowLastColumn="0"/>
-            </w:pPr>
-            <w:r>
-              <w:t>List All Potential Algorithms We Found That Ca</w:t>
-            </w:r>
-            <w:r>
-              <w:t>n Utilize the Data from 3/15 for Our Intended Goal</w:t>
+              <w:t>Coded All Algorithms and All Tests Ran</w:t>
             </w:r>
           </w:p>
         </w:tc>
@@ -1232,14 +2145,13 @@
               <w:jc w:val="center"/>
             </w:pPr>
             <w:r>
-              <w:lastRenderedPageBreak/>
-              <w:t>3/25</w:t>
+              <w:t>4/9</w:t>
             </w:r>
           </w:p>
         </w:tc>
         <w:tc>
           <w:tcPr>
-            <w:tcW w:w="3870" w:type="dxa"/>
+            <w:tcW w:w="7825" w:type="dxa"/>
           </w:tcPr>
           <w:p>
             <w:pPr>
@@ -1247,21 +2159,7 @@
               <w:cnfStyle w:val="000000000000" w:firstRow="0" w:lastRow="0" w:firstColumn="0" w:lastColumn="0" w:oddVBand="0" w:evenVBand="0" w:oddHBand="0" w:evenHBand="0" w:firstRowFirstColumn="0" w:firstRowLastColumn="0" w:lastRowFirstColumn="0" w:lastRowLastColumn="0"/>
             </w:pPr>
             <w:r>
-              <w:t>Coded Algorithm(s) For Training Mosquito Seeking Model(s)</w:t>
-            </w:r>
-          </w:p>
-        </w:tc>
-        <w:tc>
-          <w:tcPr>
-            <w:tcW w:w="3955" w:type="dxa"/>
-          </w:tcPr>
-          <w:p>
-            <w:pPr>
-              <w:jc w:val="center"/>
-              <w:cnfStyle w:val="000000000000" w:firstRow="0" w:lastRow="0" w:firstColumn="0" w:lastColumn="0" w:oddVBand="0" w:evenVBand="0" w:oddHBand="0" w:evenHBand="0" w:firstRowFirstColumn="0" w:firstRowLastColumn="0" w:lastRowFirstColumn="0" w:lastRowLastColumn="0"/>
-            </w:pPr>
-            <w:r>
-              <w:t>Write Down Strengths and Limitations for the Algorithms Written Down on 3/20</w:t>
+              <w:t>Written Down Analysis of all Training Costs and Testing Results</w:t>
             </w:r>
           </w:p>
         </w:tc>
@@ -1280,105 +2178,16 @@
               <w:jc w:val="center"/>
             </w:pPr>
             <w:r>
-              <w:t>3/31</w:t>
+              <w:t>4</w:t>
             </w:r>
-          </w:p>
-        </w:tc>
-        <w:tc>
-          <w:tcPr>
-            <w:tcW w:w="3870" w:type="dxa"/>
-          </w:tcPr>
-          <w:p>
-            <w:pPr>
-              <w:jc w:val="center"/>
-              <w:cnfStyle w:val="000000100000" w:firstRow="0" w:lastRow="0" w:firstColumn="0" w:lastColumn="0" w:oddVBand="0" w:evenVBand="0" w:oddHBand="1" w:evenHBand="0" w:firstRowFirstColumn="0" w:firstRowLastColumn="0" w:lastRowFirstColumn="0" w:lastRowLastColumn="0"/>
-            </w:pPr>
             <w:r>
-              <w:t>Successfully Train Mosquito-Seeking Model(s) And Complete Tests</w:t>
-            </w:r>
-          </w:p>
-        </w:tc>
-        <w:tc>
-          <w:tcPr>
-            <w:tcW w:w="3955" w:type="dxa"/>
-          </w:tcPr>
-          <w:p>
-            <w:pPr>
-              <w:jc w:val="center"/>
-              <w:cnfStyle w:val="000000100000" w:firstRow="0" w:lastRow="0" w:firstColumn="0" w:lastColumn="0" w:oddVBand="0" w:evenVBand="0" w:oddHBand="1" w:evenHBand="0" w:firstRowFirstColumn="0" w:firstRowLastColumn="0" w:lastRowFirstColumn="0" w:lastRowLastColumn="0"/>
-            </w:pPr>
-            <w:r>
-              <w:t>Cutoff Date for All Exploration of Alternative Methods</w:t>
-            </w:r>
-          </w:p>
-        </w:tc>
-      </w:tr>
-      <w:tr>
-        <w:tc>
-          <w:tcPr>
-            <w:cnfStyle w:val="001000000000" w:firstRow="0" w:lastRow="0" w:firstColumn="1" w:lastColumn="0" w:oddVBand="0" w:evenVBand="0" w:oddHBand="0" w:evenHBand="0" w:firstRowFirstColumn="0" w:firstRowLastColumn="0" w:lastRowFirstColumn="0" w:lastRowLastColumn="0"/>
-            <w:tcW w:w="1525" w:type="dxa"/>
-          </w:tcPr>
-          <w:p>
-            <w:pPr>
-              <w:jc w:val="center"/>
-            </w:pPr>
-            <w:r>
-              <w:t>4/7</w:t>
-            </w:r>
-          </w:p>
-        </w:tc>
-        <w:tc>
-          <w:tcPr>
-            <w:tcW w:w="3870" w:type="dxa"/>
-          </w:tcPr>
-          <w:p>
-            <w:pPr>
-              <w:jc w:val="center"/>
-              <w:cnfStyle w:val="000000000000" w:firstRow="0" w:lastRow="0" w:firstColumn="0" w:lastColumn="0" w:oddVBand="0" w:evenVBand="0" w:oddHBand="0" w:evenHBand="0" w:firstRowFirstColumn="0" w:firstRowLastColumn="0" w:lastRowFirstColumn="0" w:lastRowLastColumn="0"/>
-            </w:pPr>
-            <w:r>
-              <w:t>Analysis of Model Performance, Resource Demands Written Down</w:t>
-            </w:r>
-          </w:p>
-        </w:tc>
-        <w:tc>
-          <w:tcPr>
-            <w:tcW w:w="3955" w:type="dxa"/>
-          </w:tcPr>
-          <w:p>
-            <w:pPr>
-              <w:jc w:val="center"/>
-              <w:cnfStyle w:val="000000000000" w:firstRow="0" w:lastRow="0" w:firstColumn="0" w:lastColumn="0" w:oddVBand="0" w:evenVBand="0" w:oddHBand="0" w:evenHBand="0" w:firstRowFirstColumn="0" w:firstRowLastColumn="0" w:lastRowFirstColumn="0" w:lastRowLastColumn="0"/>
-            </w:pPr>
-            <w:r>
-              <w:t>Write Down our Conclusion From Our Survey</w:t>
-            </w:r>
-          </w:p>
-        </w:tc>
-      </w:tr>
-      <w:tr>
-        <w:trPr>
-          <w:cnfStyle w:val="000000100000" w:firstRow="0" w:lastRow="0" w:firstColumn="0" w:lastColumn="0" w:oddVBand="0" w:evenVBand="0" w:oddHBand="1" w:evenHBand="0" w:firstRowFirstColumn="0" w:firstRowLastColumn="0" w:lastRowFirstColumn="0" w:lastRowLastColumn="0"/>
-        </w:trPr>
-        <w:tc>
-          <w:tcPr>
-            <w:cnfStyle w:val="001000000000" w:firstRow="0" w:lastRow="0" w:firstColumn="1" w:lastColumn="0" w:oddVBand="0" w:evenVBand="0" w:oddHBand="0" w:evenHBand="0" w:firstRowFirstColumn="0" w:firstRowLastColumn="0" w:lastRowFirstColumn="0" w:lastRowLastColumn="0"/>
-            <w:tcW w:w="1525" w:type="dxa"/>
-          </w:tcPr>
-          <w:p>
-            <w:pPr>
-              <w:jc w:val="center"/>
-            </w:pPr>
-            <w:r>
-              <w:t>4/14</w:t>
+              <w:t>/14</w:t>
             </w:r>
           </w:p>
         </w:tc>
         <w:tc>
           <w:tcPr>
             <w:tcW w:w="7825" w:type="dxa"/>
-            <w:gridSpan w:val="2"/>
           </w:tcPr>
           <w:p>
             <w:pPr>
@@ -1402,14 +2211,13 @@
               <w:jc w:val="center"/>
             </w:pPr>
             <w:r>
-              <w:t>4/20</w:t>
+              <w:t>4/21-4/30</w:t>
             </w:r>
           </w:p>
         </w:tc>
         <w:tc>
           <w:tcPr>
             <w:tcW w:w="7825" w:type="dxa"/>
-            <w:gridSpan w:val="2"/>
           </w:tcPr>
           <w:p>
             <w:pPr>
@@ -1417,7 +2225,7 @@
               <w:cnfStyle w:val="000000000000" w:firstRow="0" w:lastRow="0" w:firstColumn="0" w:lastColumn="0" w:oddVBand="0" w:evenVBand="0" w:oddHBand="0" w:evenHBand="0" w:firstRowFirstColumn="0" w:firstRowLastColumn="0" w:lastRowFirstColumn="0" w:lastRowLastColumn="0"/>
             </w:pPr>
             <w:r>
-              <w:t>Paper Revisions Following Draft Feedback</w:t>
+              <w:t>Project Presentation</w:t>
             </w:r>
           </w:p>
         </w:tc>
@@ -1436,37 +2244,6 @@
               <w:jc w:val="center"/>
             </w:pPr>
             <w:r>
-              <w:t>4/21-4/30</w:t>
-            </w:r>
-          </w:p>
-        </w:tc>
-        <w:tc>
-          <w:tcPr>
-            <w:tcW w:w="7825" w:type="dxa"/>
-            <w:gridSpan w:val="2"/>
-          </w:tcPr>
-          <w:p>
-            <w:pPr>
-              <w:jc w:val="center"/>
-              <w:cnfStyle w:val="000000100000" w:firstRow="0" w:lastRow="0" w:firstColumn="0" w:lastColumn="0" w:oddVBand="0" w:evenVBand="0" w:oddHBand="1" w:evenHBand="0" w:firstRowFirstColumn="0" w:firstRowLastColumn="0" w:lastRowFirstColumn="0" w:lastRowLastColumn="0"/>
-            </w:pPr>
-            <w:r>
-              <w:t>Project Presentation</w:t>
-            </w:r>
-          </w:p>
-        </w:tc>
-      </w:tr>
-      <w:tr>
-        <w:tc>
-          <w:tcPr>
-            <w:cnfStyle w:val="001000000000" w:firstRow="0" w:lastRow="0" w:firstColumn="1" w:lastColumn="0" w:oddVBand="0" w:evenVBand="0" w:oddHBand="0" w:evenHBand="0" w:firstRowFirstColumn="0" w:firstRowLastColumn="0" w:lastRowFirstColumn="0" w:lastRowLastColumn="0"/>
-            <w:tcW w:w="1525" w:type="dxa"/>
-          </w:tcPr>
-          <w:p>
-            <w:pPr>
-              <w:jc w:val="center"/>
-            </w:pPr>
-            <w:r>
               <w:t>5/8</w:t>
             </w:r>
           </w:p>
@@ -1474,12 +2251,11 @@
         <w:tc>
           <w:tcPr>
             <w:tcW w:w="7825" w:type="dxa"/>
-            <w:gridSpan w:val="2"/>
           </w:tcPr>
           <w:p>
             <w:pPr>
               <w:jc w:val="center"/>
-              <w:cnfStyle w:val="000000000000" w:firstRow="0" w:lastRow="0" w:firstColumn="0" w:lastColumn="0" w:oddVBand="0" w:evenVBand="0" w:oddHBand="0" w:evenHBand="0" w:firstRowFirstColumn="0" w:firstRowLastColumn="0" w:lastRowFirstColumn="0" w:lastRowLastColumn="0"/>
+              <w:cnfStyle w:val="000000100000" w:firstRow="0" w:lastRow="0" w:firstColumn="0" w:lastColumn="0" w:oddVBand="0" w:evenVBand="0" w:oddHBand="1" w:evenHBand="0" w:firstRowFirstColumn="0" w:firstRowLastColumn="0" w:lastRowFirstColumn="0" w:lastRowLastColumn="0"/>
             </w:pPr>
             <w:r>
               <w:t>Final Paper Due</w:t>
@@ -1529,12 +2305,9 @@
         <w:t xml:space="preserve"> </w:t>
       </w:r>
       <w:r>
-        <w:t>2019-2026 Waymo LLC</w:t>
-      </w:r>
-      <w:r>
-        <w:t xml:space="preserve">; </w:t>
-      </w:r>
-      <w:hyperlink r:id="rId6" w:history="1">
+        <w:t xml:space="preserve">2019-2026 Waymo LLC; </w:t>
+      </w:r>
+      <w:hyperlink r:id="rId8" w:history="1">
         <w:r>
           <w:rPr>
             <w:rStyle w:val="Hyperlink"/>
@@ -1591,7 +2364,7 @@
       <w:r>
         <w:t xml:space="preserve"> </w:t>
       </w:r>
-      <w:hyperlink r:id="rId7" w:history="1">
+      <w:hyperlink r:id="rId9" w:history="1">
         <w:r>
           <w:rPr>
             <w:rStyle w:val="Hyperlink"/>
@@ -1636,7 +2409,7 @@
       <w:r>
         <w:t xml:space="preserve"> </w:t>
       </w:r>
-      <w:hyperlink r:id="rId8" w:history="1">
+      <w:hyperlink r:id="rId10" w:history="1">
         <w:r>
           <w:rPr>
             <w:rStyle w:val="Hyperlink"/>
@@ -1666,7 +2439,7 @@
       <w:r>
         <w:t xml:space="preserve">, </w:t>
       </w:r>
-      <w:hyperlink r:id="rId9" w:history="1">
+      <w:hyperlink r:id="rId11" w:history="1">
         <w:r>
           <w:rPr>
             <w:rStyle w:val="Hyperlink"/>
@@ -1684,55 +2457,51 @@
         </w:numPr>
       </w:pPr>
       <w:r>
-        <w:t>Stefanie Allgeier, Anna Friedrich, Carsten A. Brühl,</w:t>
-      </w:r>
-      <w:r>
-        <w:t xml:space="preserve"> </w:t>
+        <w:t xml:space="preserve">Stefanie Allgeier, Anna Friedrich, Carsten A. Brühl, </w:t>
       </w:r>
       <w:r>
         <w:rPr>
           <w:i/>
           <w:iCs/>
         </w:rPr>
-        <w:t>Mosquito control based on Bacillus thuringiensis israelensis (Bti) interrupts artificial wetland food chains</w:t>
-      </w:r>
-      <w:r>
-        <w:t>,</w:t>
-      </w:r>
-      <w:r>
-        <w:t xml:space="preserve"> </w:t>
-      </w:r>
-      <w:r>
-        <w:t>Science of The Total Environment,</w:t>
-      </w:r>
-      <w:r>
-        <w:t xml:space="preserve"> </w:t>
-      </w:r>
-      <w:r>
-        <w:t>Volume 686,</w:t>
-      </w:r>
-      <w:r>
-        <w:t xml:space="preserve"> </w:t>
-      </w:r>
-      <w:r>
-        <w:t>2019,</w:t>
-      </w:r>
-      <w:r>
-        <w:t xml:space="preserve"> </w:t>
-      </w:r>
-      <w:r>
-        <w:t>Pages 1173-1184,</w:t>
-      </w:r>
-      <w:r>
-        <w:t xml:space="preserve"> </w:t>
-      </w:r>
-      <w:r>
-        <w:t>ISSN 0048-9697,</w:t>
-      </w:r>
-      <w:r>
-        <w:t xml:space="preserve"> </w:t>
-      </w:r>
-      <w:hyperlink r:id="rId10" w:history="1">
+        <w:t xml:space="preserve">Mosquito control based on Bacillus thuringiensis </w:t>
+      </w:r>
+      <w:proofErr w:type="spellStart"/>
+      <w:r>
+        <w:rPr>
+          <w:i/>
+          <w:iCs/>
+        </w:rPr>
+        <w:t>israelensis</w:t>
+      </w:r>
+      <w:proofErr w:type="spellEnd"/>
+      <w:r>
+        <w:rPr>
+          <w:i/>
+          <w:iCs/>
+        </w:rPr>
+        <w:t xml:space="preserve"> (</w:t>
+      </w:r>
+      <w:proofErr w:type="spellStart"/>
+      <w:r>
+        <w:rPr>
+          <w:i/>
+          <w:iCs/>
+        </w:rPr>
+        <w:t>Bti</w:t>
+      </w:r>
+      <w:proofErr w:type="spellEnd"/>
+      <w:r>
+        <w:rPr>
+          <w:i/>
+          <w:iCs/>
+        </w:rPr>
+        <w:t>) interrupts artificial wetland food chains</w:t>
+      </w:r>
+      <w:r>
+        <w:t xml:space="preserve">, Science of The Total Environment, Volume 686, 2019, Pages 1173-1184, ISSN 0048-9697, </w:t>
+      </w:r>
+      <w:hyperlink r:id="rId12" w:history="1">
         <w:r>
           <w:rPr>
             <w:rStyle w:val="Hyperlink"/>
@@ -1765,7 +2534,7 @@
       <w:r>
         <w:t xml:space="preserve">; </w:t>
       </w:r>
-      <w:hyperlink r:id="rId11" w:history="1">
+      <w:hyperlink r:id="rId13" w:history="1">
         <w:r>
           <w:rPr>
             <w:rStyle w:val="Hyperlink"/>
@@ -1783,7 +2552,23 @@
         </w:numPr>
       </w:pPr>
       <w:r>
-        <w:t>Bevacqua, E., Schleussner, CF. &amp; Zscheischler, J</w:t>
+        <w:t xml:space="preserve">Bevacqua, E., </w:t>
+      </w:r>
+      <w:proofErr w:type="spellStart"/>
+      <w:r>
+        <w:t>Schleussner</w:t>
+      </w:r>
+      <w:proofErr w:type="spellEnd"/>
+      <w:r>
+        <w:t xml:space="preserve">, CF. &amp; </w:t>
+      </w:r>
+      <w:proofErr w:type="spellStart"/>
+      <w:r>
+        <w:t>Zscheischler</w:t>
+      </w:r>
+      <w:proofErr w:type="spellEnd"/>
+      <w:r>
+        <w:t>, J</w:t>
       </w:r>
       <w:r>
         <w:t>. A year above 1.5</w:t>
@@ -1832,7 +2617,7 @@
       <w:r>
         <w:t xml:space="preserve">, 262–265 (2025). </w:t>
       </w:r>
-      <w:hyperlink r:id="rId12" w:history="1">
+      <w:hyperlink r:id="rId14" w:history="1">
         <w:r>
           <w:rPr>
             <w:rStyle w:val="Hyperlink"/>
@@ -1893,7 +2678,7 @@
       <w:r>
         <w:t xml:space="preserve">, 266–269 (2025). </w:t>
       </w:r>
-      <w:hyperlink r:id="rId13" w:history="1">
+      <w:hyperlink r:id="rId15" w:history="1">
         <w:r>
           <w:rPr>
             <w:rStyle w:val="Hyperlink"/>
@@ -1911,7 +2696,6 @@
         </w:numPr>
       </w:pPr>
       <w:r>
-        <w:lastRenderedPageBreak/>
         <w:t xml:space="preserve">MMCD, 2026, </w:t>
       </w:r>
       <w:r>
@@ -1924,7 +2708,7 @@
       <w:r>
         <w:t xml:space="preserve">, </w:t>
       </w:r>
-      <w:hyperlink r:id="rId14" w:history="1">
+      <w:hyperlink r:id="rId16" w:history="1">
         <w:r>
           <w:rPr>
             <w:rStyle w:val="Hyperlink"/>
@@ -1932,6 +2716,82 @@
           <w:t>https://mmcd.org/mosquito-control/</w:t>
         </w:r>
       </w:hyperlink>
+    </w:p>
+    <w:p>
+      <w:pPr>
+        <w:pStyle w:val="ListParagraph"/>
+        <w:numPr>
+          <w:ilvl w:val="0"/>
+          <w:numId w:val="2"/>
+        </w:numPr>
+      </w:pPr>
+      <w:r>
+        <w:t xml:space="preserve">BBC, 20 February 2026 BBC, </w:t>
+      </w:r>
+      <w:r>
+        <w:rPr>
+          <w:i/>
+          <w:iCs/>
+        </w:rPr>
+        <w:t>Royal Family tree: King Charles III’s closest family and line of succession</w:t>
+      </w:r>
+      <w:r>
+        <w:t xml:space="preserve">, </w:t>
+      </w:r>
+      <w:hyperlink r:id="rId17" w:history="1">
+        <w:r>
+          <w:rPr>
+            <w:rStyle w:val="Hyperlink"/>
+          </w:rPr>
+          <w:t>https://www.bbc.com/news/articles/c867plj4vgqo</w:t>
+        </w:r>
+      </w:hyperlink>
+    </w:p>
+    <w:p>
+      <w:pPr>
+        <w:pStyle w:val="ListParagraph"/>
+        <w:numPr>
+          <w:ilvl w:val="0"/>
+          <w:numId w:val="2"/>
+        </w:numPr>
+      </w:pPr>
+      <w:r>
+        <w:t xml:space="preserve">L. Zeng et al., </w:t>
+      </w:r>
+      <w:r>
+        <w:rPr>
+          <w:i/>
+          <w:iCs/>
+        </w:rPr>
+        <w:t xml:space="preserve">Edge Graph Intelligence: Reciprocally Empowering Edge Networks </w:t>
+      </w:r>
+      <w:proofErr w:type="gramStart"/>
+      <w:r>
+        <w:rPr>
+          <w:i/>
+          <w:iCs/>
+        </w:rPr>
+        <w:t>With</w:t>
+      </w:r>
+      <w:proofErr w:type="gramEnd"/>
+      <w:r>
+        <w:rPr>
+          <w:i/>
+          <w:iCs/>
+        </w:rPr>
+        <w:t xml:space="preserve"> Graph Intelligence</w:t>
+      </w:r>
+      <w:r>
+        <w:t xml:space="preserve">, in IEEE Communications Surveys &amp; Tutorials, vol. 27, no. 6, pp. 3417-3454, Dec. 2025, </w:t>
+      </w:r>
+      <w:proofErr w:type="spellStart"/>
+      <w:r>
+        <w:t>doi</w:t>
+      </w:r>
+      <w:proofErr w:type="spellEnd"/>
+      <w:r>
+        <w:t>: 10.1109/COMST.2025.3527561.</w:t>
+      </w:r>
     </w:p>
     <w:p>
       <w:pPr>
@@ -2738,6 +3598,7 @@
   <w:style w:type="character" w:default="1" w:styleId="DefaultParagraphFont">
     <w:name w:val="Default Paragraph Font"/>
     <w:uiPriority w:val="1"/>
+    <w:semiHidden/>
     <w:unhideWhenUsed/>
   </w:style>
   <w:style w:type="table" w:default="1" w:styleId="TableNormal">

</xml_diff>